<commit_message>
Stratified human benchmark: reuse the 32 surviving v3 labels, sample 40 from v4-only candidates
The v3 review already covers the 350 candidates both versions extract; the 233
admitted only by v4 had no labels and are where precision is least certain.
Population weighting replaces pooling, cutting new labelling from 200 to 140
sentences. Also removes the stale 26-claim colour key from the report.

Co-Authored-By: Claude Opus 5 <noreply@anthropic.com>
</commit_message>
<xml_diff>
--- a/paper/GreenBERT_Project_Report_v3_REVIEW.docx
+++ b/paper/GreenBERT_Project_Report_v3_REVIEW.docx
@@ -57,6 +57,8 @@
         <w:rPr>
           <w:i w:val="1"/>
           <w:iCs w:val="1"/>
+          <w:strike/>
+          <w:color w:val="B00000"/>
           <w:sz w:val="18"/>
           <w:szCs w:val="18"/>
           <w:rtl w:val="0"/>
@@ -67,6 +69,8 @@
         <w:rPr>
           <w:i w:val="1"/>
           <w:iCs w:val="1"/>
+          <w:strike/>
+          <w:color w:val="B00000"/>
           <w:sz w:val="18"/>
           <w:szCs w:val="18"/>
           <w:highlight w:val="green"/>
@@ -78,6 +82,8 @@
         <w:rPr>
           <w:i w:val="1"/>
           <w:iCs w:val="1"/>
+          <w:strike/>
+          <w:color w:val="B00000"/>
           <w:sz w:val="18"/>
           <w:szCs w:val="18"/>
           <w:rtl w:val="0"/>
@@ -88,6 +94,8 @@
         <w:rPr>
           <w:i w:val="1"/>
           <w:iCs w:val="1"/>
+          <w:strike/>
+          <w:color w:val="B00000"/>
           <w:sz w:val="18"/>
           <w:szCs w:val="18"/>
           <w:highlight w:val="yellow"/>
@@ -97,8 +105,19 @@
       </w:r>
       <w:r>
         <w:rPr>
-          <w:rtl w:val="0"/>
-        </w:rPr>
+          <w:strike/>
+          <w:color w:val="B00000"/>
+          <w:rtl w:val="0"/>
+        </w:rPr>
+      </w:r>
+    </w:p>
+    <w:p>
+      <w:r>
+        <w:rPr>
+          <w:rFonts w:ascii="Times New Roman" w:hAnsi="Times New Roman"/>
+          <w:highlight w:val="green"/>
+        </w:rPr>
+        <w:t>Colour key: no highlight = existing report text | green = new text added | yellow = provisional figure from a small sample | red highlight = assumed value awaiting the human labels.</w:t>
       </w:r>
     </w:p>
     <w:p>
@@ -5603,14 +5622,28 @@
           <w:rFonts w:ascii="Times New Roman" w:hAnsi="Times New Roman"/>
           <w:highlight w:val="green"/>
         </w:rPr>
-        <w:t xml:space="preserve">The human benchmark for the final engine consists of 200 sentences from the Unilever sustainability statement, drawn in two strata of equal size. The first stratum is a random sample of 100 sentences from the 583 candidates extracted by the frozen v4 engine; the second is a random sample of 100 sentences from the 1,535 sentences the engine rejected, drawn from the rejected-sentence file with the rejection reasons withheld from the annotators so that they cannot bias the judgement. Both samples were drawn with a fixed random seed so that they can be regenerated exactly. Each sentence is labelled Yes or No against the WP1.5 operational definition of a claim, together with its ESG type and a written rationale, by the two annotators under the same protocol as the earlier rounds, with page context permitted when a sentence is ambiguous alone. Labels on extracted sentences later become true positives and false positives; labels on rejected sentences become false negatives and true negatives. Five sentences of the extracted stratum had already been labelled during the v3 inspection and their labels were carried over. </w:t>
+        <w:t>The human benchmark for the frozen engine consists of two strata of sentences from the Unilever sustainability statement, each labelled Yes or No against the WP1.5 operational definition of a claim, together with its ESG type and a written rationale, with page context permitted when a sentence is ambiguous alone.</w:t>
+      </w:r>
+      <w:r>
+        <w:rPr>
+          <w:rFonts w:ascii="Times New Roman" w:hAnsi="Times New Roman"/>
+          <w:highlight w:val="green"/>
+        </w:rPr>
+        <w:t xml:space="preserve"> The first stratum covers the sentences the engine extracts. The final engine and its predecessor share a large part of their output: of the 583 candidates extracted by the final engine, 350 were also extracted by v3 and 233 are admitted only by the widened detection gate of the final revision. The manual review of 100 v3 candidates reported in WP3 therefore already covers the first group, and 32 of those labelled sentences are retained by the final engine; the second group has never been labelled, and because it consists precisely of the sentences the widened gate newly admits, it is where precision is least certain. A fresh random sample of 40 sentences was drawn from it. The two groups are combined by weighting each by its share of the extracted output rather than by pooling the labels. This stratified estimate avoids re-labelling sentences that have already been judged, and it avoids the bias that would follow from measuring the final engine only on the part of its output that its predecessor also produced.</w:t>
+      </w:r>
+      <w:r>
+        <w:rPr>
+          <w:rFonts w:ascii="Times New Roman" w:hAnsi="Times New Roman"/>
+          <w:highlight w:val="green"/>
+        </w:rPr>
+        <w:t xml:space="preserve"> The second stratum covers the sentences the engine rejects: a random sample of 100 of the 1,535 sentences recorded in the rejected-sentence file, drawn with the rejection reasons withheld from the annotators so that they cannot bias the judgement. Labels on extracted sentences become true positives and false positives; labels on rejected sentences become false negatives and true negatives. All samples were drawn with a fixed random seed so that they can be regenerated exactly, and the benchmark totals 172 labelled sentences across the two strata.</w:t>
       </w:r>
       <w:r>
         <w:rPr>
           <w:rFonts w:ascii="Times New Roman" w:hAnsi="Times New Roman"/>
           <w:highlight w:val="red"/>
         </w:rPr>
-        <w:t>Annotation status in this draft: the extracted stratum is assumed to contain 72 Yes and 28 No (the rate observed on the v3-inspection sentences that the final engine retains), and the rejected stratum is assumed to contain 5 Yes and 95 No. Both will be replaced by the actual labels.</w:t>
+        <w:t xml:space="preserve"> Annotation status in this draft: the 32 carried-over labels are final (23 Yes, 9 No); the 40 newly sampled extracted sentences and the 100 rejected sentences are assumed to contain 50% and 5% genuine claims respectively, and both will be replaced by the actual labels.</w:t>
       </w:r>
     </w:p>
     <w:p>
@@ -7181,7 +7214,7 @@
           <w:rFonts w:ascii="Times New Roman" w:hAnsi="Times New Roman"/>
           <w:highlight w:val="green"/>
         </w:rPr>
-        <w:t>The 200 labels define the confusion matrix of the frozen engine on the Unilever statement. Extracted sentences labelled Yes are true positives and those labelled No are false positives; rejected sentences labelled Yes are false negatives and those labelled No are true negatives (Table 3).</w:t>
+        <w:t>The labels are first summarised per stratum (Table 3) and then scaled to the populations the strata represent, which is necessary because the three groups differ greatly in size: 350 sentences extracted by both versions, 233 extracted only by the final version, and 1,535 rejected. Scaling each group by its own population and summing gives the estimated confusion matrix of the engine over the whole report (Table 4).</w:t>
       </w:r>
     </w:p>
     <w:p>
@@ -7190,7 +7223,7 @@
           <w:rFonts w:ascii="Times New Roman" w:hAnsi="Times New Roman"/>
           <w:highlight w:val="green"/>
         </w:rPr>
-        <w:t>Table 3. Confusion matrix of the frozen v4 engine on the 200-sentence human benchmark (values in red are assumed and will be replaced by the actual labels).</w:t>
+        <w:t>Table 3. Human labels by stratum (values in red are assumed and will be replaced by the actual labels).</w:t>
       </w:r>
     </w:p>
     <w:tbl>
@@ -7210,15 +7243,16 @@
         <w:tblLook w:val="0600"/>
       </w:tblPr>
       <w:tblGrid>
-        <w:gridCol w:w="2160"/>
-        <w:gridCol w:w="2160"/>
-        <w:gridCol w:w="2160"/>
-        <w:gridCol w:w="2160"/>
+        <w:gridCol w:w="1728"/>
+        <w:gridCol w:w="1728"/>
+        <w:gridCol w:w="1728"/>
+        <w:gridCol w:w="1728"/>
+        <w:gridCol w:w="1728"/>
       </w:tblGrid>
       <w:tr>
         <w:tc>
           <w:tcPr>
-            <w:tcW w:type="dxa" w:w="2160"/>
+            <w:tcW w:type="dxa" w:w="1728"/>
           </w:tcPr>
           <w:p>
             <w:r/>
@@ -7229,12 +7263,13 @@
                 <w:sz w:val="18"/>
                 <w:highlight w:val="green"/>
               </w:rPr>
-            </w:r>
-          </w:p>
-        </w:tc>
-        <w:tc>
-          <w:tcPr>
-            <w:tcW w:type="dxa" w:w="2160"/>
+              <w:t>Stratum</w:t>
+            </w:r>
+          </w:p>
+        </w:tc>
+        <w:tc>
+          <w:tcPr>
+            <w:tcW w:type="dxa" w:w="1728"/>
           </w:tcPr>
           <w:p>
             <w:r/>
@@ -7245,13 +7280,13 @@
                 <w:sz w:val="18"/>
                 <w:highlight w:val="green"/>
               </w:rPr>
-              <w:t>Human: claim (Yes)</w:t>
-            </w:r>
-          </w:p>
-        </w:tc>
-        <w:tc>
-          <w:tcPr>
-            <w:tcW w:type="dxa" w:w="2160"/>
+              <w:t>Population</w:t>
+            </w:r>
+          </w:p>
+        </w:tc>
+        <w:tc>
+          <w:tcPr>
+            <w:tcW w:type="dxa" w:w="1728"/>
           </w:tcPr>
           <w:p>
             <w:r/>
@@ -7262,13 +7297,13 @@
                 <w:sz w:val="18"/>
                 <w:highlight w:val="green"/>
               </w:rPr>
-              <w:t>Human: not a claim (No)</w:t>
-            </w:r>
-          </w:p>
-        </w:tc>
-        <w:tc>
-          <w:tcPr>
-            <w:tcW w:type="dxa" w:w="2160"/>
+              <w:t>Sampled</w:t>
+            </w:r>
+          </w:p>
+        </w:tc>
+        <w:tc>
+          <w:tcPr>
+            <w:tcW w:type="dxa" w:w="1728"/>
           </w:tcPr>
           <w:p>
             <w:r/>
@@ -7279,15 +7314,13 @@
                 <w:sz w:val="18"/>
                 <w:highlight w:val="green"/>
               </w:rPr>
-              <w:t>Total</w:t>
-            </w:r>
-          </w:p>
-        </w:tc>
-      </w:tr>
-      <w:tr>
-        <w:tc>
-          <w:tcPr>
-            <w:tcW w:type="dxa" w:w="2160"/>
+              <w:t>Yes</w:t>
+            </w:r>
+          </w:p>
+        </w:tc>
+        <w:tc>
+          <w:tcPr>
+            <w:tcW w:type="dxa" w:w="1728"/>
           </w:tcPr>
           <w:p>
             <w:r/>
@@ -7298,55 +7331,7 @@
                 <w:sz w:val="18"/>
                 <w:highlight w:val="green"/>
               </w:rPr>
-              <w:t>Engine extracted (100 sampled of 583)</w:t>
-            </w:r>
-          </w:p>
-        </w:tc>
-        <w:tc>
-          <w:tcPr>
-            <w:tcW w:type="dxa" w:w="2160"/>
-          </w:tcPr>
-          <w:p>
-            <w:r/>
-            <w:r>
-              <w:rPr>
-                <w:rFonts w:ascii="Times New Roman" w:hAnsi="Times New Roman"/>
-                <w:sz w:val="18"/>
-                <w:highlight w:val="red"/>
-              </w:rPr>
-              <w:t>TP = 72</w:t>
-            </w:r>
-          </w:p>
-        </w:tc>
-        <w:tc>
-          <w:tcPr>
-            <w:tcW w:type="dxa" w:w="2160"/>
-          </w:tcPr>
-          <w:p>
-            <w:r/>
-            <w:r>
-              <w:rPr>
-                <w:rFonts w:ascii="Times New Roman" w:hAnsi="Times New Roman"/>
-                <w:sz w:val="18"/>
-                <w:highlight w:val="red"/>
-              </w:rPr>
-              <w:t>FP = 28</w:t>
-            </w:r>
-          </w:p>
-        </w:tc>
-        <w:tc>
-          <w:tcPr>
-            <w:tcW w:type="dxa" w:w="2160"/>
-          </w:tcPr>
-          <w:p>
-            <w:r/>
-            <w:r>
-              <w:rPr>
-                <w:rFonts w:ascii="Times New Roman" w:hAnsi="Times New Roman"/>
-                <w:sz w:val="18"/>
-                <w:highlight w:val="green"/>
-              </w:rPr>
-              <w:t>100</w:t>
+              <w:t>No</w:t>
             </w:r>
           </w:p>
         </w:tc>
@@ -7354,7 +7339,7 @@
       <w:tr>
         <w:tc>
           <w:tcPr>
-            <w:tcW w:type="dxa" w:w="2160"/>
+            <w:tcW w:type="dxa" w:w="1728"/>
           </w:tcPr>
           <w:p>
             <w:r/>
@@ -7365,13 +7350,128 @@
                 <w:sz w:val="18"/>
                 <w:highlight w:val="green"/>
               </w:rPr>
-              <w:t>Engine rejected (100 sampled of 1,535)</w:t>
-            </w:r>
-          </w:p>
-        </w:tc>
-        <w:tc>
-          <w:tcPr>
-            <w:tcW w:type="dxa" w:w="2160"/>
+              <w:t>Extracted, also extracted by v3</w:t>
+            </w:r>
+          </w:p>
+        </w:tc>
+        <w:tc>
+          <w:tcPr>
+            <w:tcW w:type="dxa" w:w="1728"/>
+          </w:tcPr>
+          <w:p>
+            <w:r/>
+            <w:r>
+              <w:rPr>
+                <w:rFonts w:ascii="Times New Roman" w:hAnsi="Times New Roman"/>
+                <w:sz w:val="18"/>
+                <w:highlight w:val="green"/>
+              </w:rPr>
+              <w:t>350</w:t>
+            </w:r>
+          </w:p>
+        </w:tc>
+        <w:tc>
+          <w:tcPr>
+            <w:tcW w:type="dxa" w:w="1728"/>
+          </w:tcPr>
+          <w:p>
+            <w:r/>
+            <w:r>
+              <w:rPr>
+                <w:rFonts w:ascii="Times New Roman" w:hAnsi="Times New Roman"/>
+                <w:sz w:val="18"/>
+                <w:highlight w:val="green"/>
+              </w:rPr>
+              <w:t>32</w:t>
+            </w:r>
+          </w:p>
+        </w:tc>
+        <w:tc>
+          <w:tcPr>
+            <w:tcW w:type="dxa" w:w="1728"/>
+          </w:tcPr>
+          <w:p>
+            <w:r/>
+            <w:r>
+              <w:rPr>
+                <w:rFonts w:ascii="Times New Roman" w:hAnsi="Times New Roman"/>
+                <w:sz w:val="18"/>
+                <w:highlight w:val="green"/>
+              </w:rPr>
+              <w:t>23</w:t>
+            </w:r>
+          </w:p>
+        </w:tc>
+        <w:tc>
+          <w:tcPr>
+            <w:tcW w:type="dxa" w:w="1728"/>
+          </w:tcPr>
+          <w:p>
+            <w:r/>
+            <w:r>
+              <w:rPr>
+                <w:rFonts w:ascii="Times New Roman" w:hAnsi="Times New Roman"/>
+                <w:sz w:val="18"/>
+                <w:highlight w:val="green"/>
+              </w:rPr>
+              <w:t>9</w:t>
+            </w:r>
+          </w:p>
+        </w:tc>
+      </w:tr>
+      <w:tr>
+        <w:tc>
+          <w:tcPr>
+            <w:tcW w:type="dxa" w:w="1728"/>
+          </w:tcPr>
+          <w:p>
+            <w:r/>
+            <w:r>
+              <w:rPr>
+                <w:rFonts w:ascii="Times New Roman" w:hAnsi="Times New Roman"/>
+                <w:b/>
+                <w:sz w:val="18"/>
+                <w:highlight w:val="green"/>
+              </w:rPr>
+              <w:t>Extracted, admitted only by v4</w:t>
+            </w:r>
+          </w:p>
+        </w:tc>
+        <w:tc>
+          <w:tcPr>
+            <w:tcW w:type="dxa" w:w="1728"/>
+          </w:tcPr>
+          <w:p>
+            <w:r/>
+            <w:r>
+              <w:rPr>
+                <w:rFonts w:ascii="Times New Roman" w:hAnsi="Times New Roman"/>
+                <w:sz w:val="18"/>
+                <w:highlight w:val="green"/>
+              </w:rPr>
+              <w:t>233</w:t>
+            </w:r>
+          </w:p>
+        </w:tc>
+        <w:tc>
+          <w:tcPr>
+            <w:tcW w:type="dxa" w:w="1728"/>
+          </w:tcPr>
+          <w:p>
+            <w:r/>
+            <w:r>
+              <w:rPr>
+                <w:rFonts w:ascii="Times New Roman" w:hAnsi="Times New Roman"/>
+                <w:sz w:val="18"/>
+                <w:highlight w:val="green"/>
+              </w:rPr>
+              <w:t>40</w:t>
+            </w:r>
+          </w:p>
+        </w:tc>
+        <w:tc>
+          <w:tcPr>
+            <w:tcW w:type="dxa" w:w="1728"/>
           </w:tcPr>
           <w:p>
             <w:r/>
@@ -7381,13 +7481,13 @@
                 <w:sz w:val="18"/>
                 <w:highlight w:val="red"/>
               </w:rPr>
-              <w:t>FN = 5</w:t>
-            </w:r>
-          </w:p>
-        </w:tc>
-        <w:tc>
-          <w:tcPr>
-            <w:tcW w:type="dxa" w:w="2160"/>
+              <w:t>20</w:t>
+            </w:r>
+          </w:p>
+        </w:tc>
+        <w:tc>
+          <w:tcPr>
+            <w:tcW w:type="dxa" w:w="1728"/>
           </w:tcPr>
           <w:p>
             <w:r/>
@@ -7397,13 +7497,32 @@
                 <w:sz w:val="18"/>
                 <w:highlight w:val="red"/>
               </w:rPr>
-              <w:t>TN = 95</w:t>
-            </w:r>
-          </w:p>
-        </w:tc>
-        <w:tc>
-          <w:tcPr>
-            <w:tcW w:type="dxa" w:w="2160"/>
+              <w:t>20</w:t>
+            </w:r>
+          </w:p>
+        </w:tc>
+      </w:tr>
+      <w:tr>
+        <w:tc>
+          <w:tcPr>
+            <w:tcW w:type="dxa" w:w="1728"/>
+          </w:tcPr>
+          <w:p>
+            <w:r/>
+            <w:r>
+              <w:rPr>
+                <w:rFonts w:ascii="Times New Roman" w:hAnsi="Times New Roman"/>
+                <w:b/>
+                <w:sz w:val="18"/>
+                <w:highlight w:val="green"/>
+              </w:rPr>
+              <w:t>Rejected (non-extracted)</w:t>
+            </w:r>
+          </w:p>
+        </w:tc>
+        <w:tc>
+          <w:tcPr>
+            <w:tcW w:type="dxa" w:w="1728"/>
           </w:tcPr>
           <w:p>
             <w:r/>
@@ -7413,7 +7532,55 @@
                 <w:sz w:val="18"/>
                 <w:highlight w:val="green"/>
               </w:rPr>
+              <w:t>1,535</w:t>
+            </w:r>
+          </w:p>
+        </w:tc>
+        <w:tc>
+          <w:tcPr>
+            <w:tcW w:type="dxa" w:w="1728"/>
+          </w:tcPr>
+          <w:p>
+            <w:r/>
+            <w:r>
+              <w:rPr>
+                <w:rFonts w:ascii="Times New Roman" w:hAnsi="Times New Roman"/>
+                <w:sz w:val="18"/>
+                <w:highlight w:val="green"/>
+              </w:rPr>
               <w:t>100</w:t>
+            </w:r>
+          </w:p>
+        </w:tc>
+        <w:tc>
+          <w:tcPr>
+            <w:tcW w:type="dxa" w:w="1728"/>
+          </w:tcPr>
+          <w:p>
+            <w:r/>
+            <w:r>
+              <w:rPr>
+                <w:rFonts w:ascii="Times New Roman" w:hAnsi="Times New Roman"/>
+                <w:sz w:val="18"/>
+                <w:highlight w:val="red"/>
+              </w:rPr>
+              <w:t>5</w:t>
+            </w:r>
+          </w:p>
+        </w:tc>
+        <w:tc>
+          <w:tcPr>
+            <w:tcW w:type="dxa" w:w="1728"/>
+          </w:tcPr>
+          <w:p>
+            <w:r/>
+            <w:r>
+              <w:rPr>
+                <w:rFonts w:ascii="Times New Roman" w:hAnsi="Times New Roman"/>
+                <w:sz w:val="18"/>
+                <w:highlight w:val="red"/>
+              </w:rPr>
+              <w:t>95</w:t>
             </w:r>
           </w:p>
         </w:tc>
@@ -7425,21 +7592,462 @@
           <w:rFonts w:ascii="Times New Roman" w:hAnsi="Times New Roman"/>
           <w:highlight w:val="green"/>
         </w:rPr>
-        <w:t xml:space="preserve">Precision is TP / (TP + FP) and is estimated directly from the extracted stratum. Because the two strata are samples of populations of different size (583 extracted and 1,535 rejected sentences), recall is estimated by scaling each stratum to its population before combining: the estimated number of genuine claims extracted is 583 × TP / 100 and the estimated number missed is 1,535 × FN / 100, and recall is the first divided by their sum. F1 is the harmonic mean of precision and recall. </w:t>
-      </w:r>
-      <w:r>
-        <w:rPr>
-          <w:rFonts w:ascii="Times New Roman" w:hAnsi="Times New Roman"/>
-          <w:highlight w:val="red"/>
-        </w:rPr>
-        <w:t>With the assumed labels, precision is 72%, the population-weighted recall is 85% (about 420 genuine claims extracted against about 77 missed), the unweighted sample recall is 94%, and F1 is 0.78. These values will be recomputed from the actual labels.</w:t>
-      </w:r>
+        <w:t>Table 4. Estimated confusion matrix and detection performance of the frozen v4 engine on the Unilever sustainability statement, obtained by scaling each stratum to its population (values in red depend on the assumed labels).</w:t>
+      </w:r>
+    </w:p>
+    <w:tbl>
+      <w:tblPr>
+        <w:tblStyle w:val="Table3"/>
+        <w:tblW w:w="10125.0" w:type="dxa"/>
+        <w:jc w:val="left"/>
+        <w:tblBorders>
+          <w:top w:color="000000" w:space="0" w:sz="0" w:val="nil"/>
+          <w:left w:color="000000" w:space="0" w:sz="0" w:val="nil"/>
+          <w:bottom w:color="000000" w:space="0" w:sz="0" w:val="nil"/>
+          <w:right w:color="000000" w:space="0" w:sz="0" w:val="nil"/>
+          <w:insideH w:color="000000" w:space="0" w:sz="0" w:val="nil"/>
+          <w:insideV w:color="000000" w:space="0" w:sz="0" w:val="nil"/>
+        </w:tblBorders>
+        <w:tblLayout w:type="fixed"/>
+        <w:tblLook w:val="0600"/>
+      </w:tblPr>
+      <w:tblGrid>
+        <w:gridCol w:w="2880"/>
+        <w:gridCol w:w="2880"/>
+        <w:gridCol w:w="2880"/>
+      </w:tblGrid>
+      <w:tr>
+        <w:tc>
+          <w:tcPr>
+            <w:tcW w:type="dxa" w:w="2880"/>
+          </w:tcPr>
+          <w:p>
+            <w:r/>
+            <w:r>
+              <w:rPr>
+                <w:rFonts w:ascii="Times New Roman" w:hAnsi="Times New Roman"/>
+                <w:b/>
+                <w:sz w:val="18"/>
+                <w:highlight w:val="green"/>
+              </w:rPr>
+              <w:t>Quantity</w:t>
+            </w:r>
+          </w:p>
+        </w:tc>
+        <w:tc>
+          <w:tcPr>
+            <w:tcW w:type="dxa" w:w="2880"/>
+          </w:tcPr>
+          <w:p>
+            <w:r/>
+            <w:r>
+              <w:rPr>
+                <w:rFonts w:ascii="Times New Roman" w:hAnsi="Times New Roman"/>
+                <w:b/>
+                <w:sz w:val="18"/>
+                <w:highlight w:val="green"/>
+              </w:rPr>
+              <w:t>Estimate</w:t>
+            </w:r>
+          </w:p>
+        </w:tc>
+        <w:tc>
+          <w:tcPr>
+            <w:tcW w:type="dxa" w:w="2880"/>
+          </w:tcPr>
+          <w:p>
+            <w:r/>
+            <w:r>
+              <w:rPr>
+                <w:rFonts w:ascii="Times New Roman" w:hAnsi="Times New Roman"/>
+                <w:b/>
+                <w:sz w:val="18"/>
+                <w:highlight w:val="green"/>
+              </w:rPr>
+              <w:t>How it is obtained</w:t>
+            </w:r>
+          </w:p>
+        </w:tc>
+      </w:tr>
+      <w:tr>
+        <w:tc>
+          <w:tcPr>
+            <w:tcW w:type="dxa" w:w="2880"/>
+          </w:tcPr>
+          <w:p>
+            <w:r/>
+            <w:r>
+              <w:rPr>
+                <w:rFonts w:ascii="Times New Roman" w:hAnsi="Times New Roman"/>
+                <w:b/>
+                <w:sz w:val="18"/>
+                <w:highlight w:val="green"/>
+              </w:rPr>
+              <w:t>True positives</w:t>
+            </w:r>
+          </w:p>
+        </w:tc>
+        <w:tc>
+          <w:tcPr>
+            <w:tcW w:type="dxa" w:w="2880"/>
+          </w:tcPr>
+          <w:p>
+            <w:r/>
+            <w:r>
+              <w:rPr>
+                <w:rFonts w:ascii="Times New Roman" w:hAnsi="Times New Roman"/>
+                <w:sz w:val="18"/>
+                <w:highlight w:val="red"/>
+              </w:rPr>
+              <w:t>368</w:t>
+            </w:r>
+          </w:p>
+        </w:tc>
+        <w:tc>
+          <w:tcPr>
+            <w:tcW w:type="dxa" w:w="2880"/>
+          </w:tcPr>
+          <w:p>
+            <w:r/>
+            <w:r>
+              <w:rPr>
+                <w:rFonts w:ascii="Times New Roman" w:hAnsi="Times New Roman"/>
+                <w:sz w:val="18"/>
+                <w:highlight w:val="green"/>
+              </w:rPr>
+              <w:t>350 x 23/32 + 233 x 20/40</w:t>
+            </w:r>
+          </w:p>
+        </w:tc>
+      </w:tr>
+      <w:tr>
+        <w:tc>
+          <w:tcPr>
+            <w:tcW w:type="dxa" w:w="2880"/>
+          </w:tcPr>
+          <w:p>
+            <w:r/>
+            <w:r>
+              <w:rPr>
+                <w:rFonts w:ascii="Times New Roman" w:hAnsi="Times New Roman"/>
+                <w:b/>
+                <w:sz w:val="18"/>
+                <w:highlight w:val="green"/>
+              </w:rPr>
+              <w:t>False positives</w:t>
+            </w:r>
+          </w:p>
+        </w:tc>
+        <w:tc>
+          <w:tcPr>
+            <w:tcW w:type="dxa" w:w="2880"/>
+          </w:tcPr>
+          <w:p>
+            <w:r/>
+            <w:r>
+              <w:rPr>
+                <w:rFonts w:ascii="Times New Roman" w:hAnsi="Times New Roman"/>
+                <w:sz w:val="18"/>
+                <w:highlight w:val="red"/>
+              </w:rPr>
+              <w:t>215</w:t>
+            </w:r>
+          </w:p>
+        </w:tc>
+        <w:tc>
+          <w:tcPr>
+            <w:tcW w:type="dxa" w:w="2880"/>
+          </w:tcPr>
+          <w:p>
+            <w:r/>
+            <w:r>
+              <w:rPr>
+                <w:rFonts w:ascii="Times New Roman" w:hAnsi="Times New Roman"/>
+                <w:sz w:val="18"/>
+                <w:highlight w:val="green"/>
+              </w:rPr>
+              <w:t>350 x 9/32 + 233 x 20/40</w:t>
+            </w:r>
+          </w:p>
+        </w:tc>
+      </w:tr>
+      <w:tr>
+        <w:tc>
+          <w:tcPr>
+            <w:tcW w:type="dxa" w:w="2880"/>
+          </w:tcPr>
+          <w:p>
+            <w:r/>
+            <w:r>
+              <w:rPr>
+                <w:rFonts w:ascii="Times New Roman" w:hAnsi="Times New Roman"/>
+                <w:b/>
+                <w:sz w:val="18"/>
+                <w:highlight w:val="green"/>
+              </w:rPr>
+              <w:t>False negatives</w:t>
+            </w:r>
+          </w:p>
+        </w:tc>
+        <w:tc>
+          <w:tcPr>
+            <w:tcW w:type="dxa" w:w="2880"/>
+          </w:tcPr>
+          <w:p>
+            <w:r/>
+            <w:r>
+              <w:rPr>
+                <w:rFonts w:ascii="Times New Roman" w:hAnsi="Times New Roman"/>
+                <w:sz w:val="18"/>
+                <w:highlight w:val="red"/>
+              </w:rPr>
+              <w:t>77</w:t>
+            </w:r>
+          </w:p>
+        </w:tc>
+        <w:tc>
+          <w:tcPr>
+            <w:tcW w:type="dxa" w:w="2880"/>
+          </w:tcPr>
+          <w:p>
+            <w:r/>
+            <w:r>
+              <w:rPr>
+                <w:rFonts w:ascii="Times New Roman" w:hAnsi="Times New Roman"/>
+                <w:sz w:val="18"/>
+                <w:highlight w:val="green"/>
+              </w:rPr>
+              <w:t>1,535 x 5/100</w:t>
+            </w:r>
+          </w:p>
+        </w:tc>
+      </w:tr>
+      <w:tr>
+        <w:tc>
+          <w:tcPr>
+            <w:tcW w:type="dxa" w:w="2880"/>
+          </w:tcPr>
+          <w:p>
+            <w:r/>
+            <w:r>
+              <w:rPr>
+                <w:rFonts w:ascii="Times New Roman" w:hAnsi="Times New Roman"/>
+                <w:b/>
+                <w:sz w:val="18"/>
+                <w:highlight w:val="green"/>
+              </w:rPr>
+              <w:t>True negatives</w:t>
+            </w:r>
+          </w:p>
+        </w:tc>
+        <w:tc>
+          <w:tcPr>
+            <w:tcW w:type="dxa" w:w="2880"/>
+          </w:tcPr>
+          <w:p>
+            <w:r/>
+            <w:r>
+              <w:rPr>
+                <w:rFonts w:ascii="Times New Roman" w:hAnsi="Times New Roman"/>
+                <w:sz w:val="18"/>
+                <w:highlight w:val="red"/>
+              </w:rPr>
+              <w:t>1,458</w:t>
+            </w:r>
+          </w:p>
+        </w:tc>
+        <w:tc>
+          <w:tcPr>
+            <w:tcW w:type="dxa" w:w="2880"/>
+          </w:tcPr>
+          <w:p>
+            <w:r/>
+            <w:r>
+              <w:rPr>
+                <w:rFonts w:ascii="Times New Roman" w:hAnsi="Times New Roman"/>
+                <w:sz w:val="18"/>
+                <w:highlight w:val="green"/>
+              </w:rPr>
+              <w:t>1,535 x 95/100</w:t>
+            </w:r>
+          </w:p>
+        </w:tc>
+      </w:tr>
+      <w:tr>
+        <w:tc>
+          <w:tcPr>
+            <w:tcW w:type="dxa" w:w="2880"/>
+          </w:tcPr>
+          <w:p>
+            <w:r/>
+            <w:r>
+              <w:rPr>
+                <w:rFonts w:ascii="Times New Roman" w:hAnsi="Times New Roman"/>
+                <w:b/>
+                <w:sz w:val="18"/>
+                <w:highlight w:val="green"/>
+              </w:rPr>
+              <w:t>Precision</w:t>
+            </w:r>
+          </w:p>
+        </w:tc>
+        <w:tc>
+          <w:tcPr>
+            <w:tcW w:type="dxa" w:w="2880"/>
+          </w:tcPr>
+          <w:p>
+            <w:r/>
+            <w:r>
+              <w:rPr>
+                <w:rFonts w:ascii="Times New Roman" w:hAnsi="Times New Roman"/>
+                <w:sz w:val="18"/>
+                <w:highlight w:val="red"/>
+              </w:rPr>
+              <w:t>63%</w:t>
+            </w:r>
+          </w:p>
+        </w:tc>
+        <w:tc>
+          <w:tcPr>
+            <w:tcW w:type="dxa" w:w="2880"/>
+          </w:tcPr>
+          <w:p>
+            <w:r/>
+            <w:r>
+              <w:rPr>
+                <w:rFonts w:ascii="Times New Roman" w:hAnsi="Times New Roman"/>
+                <w:sz w:val="18"/>
+                <w:highlight w:val="green"/>
+              </w:rPr>
+              <w:t>TP / (TP + FP)</w:t>
+            </w:r>
+          </w:p>
+        </w:tc>
+      </w:tr>
+      <w:tr>
+        <w:tc>
+          <w:tcPr>
+            <w:tcW w:type="dxa" w:w="2880"/>
+          </w:tcPr>
+          <w:p>
+            <w:r/>
+            <w:r>
+              <w:rPr>
+                <w:rFonts w:ascii="Times New Roman" w:hAnsi="Times New Roman"/>
+                <w:b/>
+                <w:sz w:val="18"/>
+                <w:highlight w:val="green"/>
+              </w:rPr>
+              <w:t>Recall</w:t>
+            </w:r>
+          </w:p>
+        </w:tc>
+        <w:tc>
+          <w:tcPr>
+            <w:tcW w:type="dxa" w:w="2880"/>
+          </w:tcPr>
+          <w:p>
+            <w:r/>
+            <w:r>
+              <w:rPr>
+                <w:rFonts w:ascii="Times New Roman" w:hAnsi="Times New Roman"/>
+                <w:sz w:val="18"/>
+                <w:highlight w:val="red"/>
+              </w:rPr>
+              <w:t>83%</w:t>
+            </w:r>
+          </w:p>
+        </w:tc>
+        <w:tc>
+          <w:tcPr>
+            <w:tcW w:type="dxa" w:w="2880"/>
+          </w:tcPr>
+          <w:p>
+            <w:r/>
+            <w:r>
+              <w:rPr>
+                <w:rFonts w:ascii="Times New Roman" w:hAnsi="Times New Roman"/>
+                <w:sz w:val="18"/>
+                <w:highlight w:val="green"/>
+              </w:rPr>
+              <w:t>TP / (TP + FN)</w:t>
+            </w:r>
+          </w:p>
+        </w:tc>
+      </w:tr>
+      <w:tr>
+        <w:tc>
+          <w:tcPr>
+            <w:tcW w:type="dxa" w:w="2880"/>
+          </w:tcPr>
+          <w:p>
+            <w:r/>
+            <w:r>
+              <w:rPr>
+                <w:rFonts w:ascii="Times New Roman" w:hAnsi="Times New Roman"/>
+                <w:b/>
+                <w:sz w:val="18"/>
+                <w:highlight w:val="green"/>
+              </w:rPr>
+              <w:t>F1</w:t>
+            </w:r>
+          </w:p>
+        </w:tc>
+        <w:tc>
+          <w:tcPr>
+            <w:tcW w:type="dxa" w:w="2880"/>
+          </w:tcPr>
+          <w:p>
+            <w:r/>
+            <w:r>
+              <w:rPr>
+                <w:rFonts w:ascii="Times New Roman" w:hAnsi="Times New Roman"/>
+                <w:sz w:val="18"/>
+                <w:highlight w:val="red"/>
+              </w:rPr>
+              <w:t>0.72</w:t>
+            </w:r>
+          </w:p>
+        </w:tc>
+        <w:tc>
+          <w:tcPr>
+            <w:tcW w:type="dxa" w:w="2880"/>
+          </w:tcPr>
+          <w:p>
+            <w:r/>
+            <w:r>
+              <w:rPr>
+                <w:rFonts w:ascii="Times New Roman" w:hAnsi="Times New Roman"/>
+                <w:sz w:val="18"/>
+                <w:highlight w:val="green"/>
+              </w:rPr>
+              <w:t>harmonic mean of precision and recall</w:t>
+            </w:r>
+          </w:p>
+        </w:tc>
+      </w:tr>
+    </w:tbl>
+    <w:p>
       <w:r>
         <w:rPr>
           <w:rFonts w:ascii="Times New Roman" w:hAnsi="Times New Roman"/>
           <w:highlight w:val="green"/>
         </w:rPr>
-        <w:t xml:space="preserve"> For reference, the v3 engine measured 67% precision on the 100-candidate inspection reported in WP3; that was a development measurement on a different sample and version and is not directly comparable with the benchmark result.</w:t>
+        <w:t xml:space="preserve">Precision on the part of the output shared with v3 is 72% (23 of 32), measured on final labels; the remainder of the estimate depends on the two samples still to be labelled. </w:t>
+      </w:r>
+      <w:r>
+        <w:rPr>
+          <w:rFonts w:ascii="Times New Roman" w:hAnsi="Times New Roman"/>
+          <w:highlight w:val="green"/>
+        </w:rPr>
+        <w:t xml:space="preserve">The figures are estimates with sampling error, and the rejected stratum carries the most of it: at a low rate of missed claims, a sample of 100 rejected sentences contains only a handful of positives, so the recall estimate is the least precise number in the table and should be read as an indication rather than a point value. </w:t>
+      </w:r>
+      <w:r>
+        <w:rPr>
+          <w:rFonts w:ascii="Times New Roman" w:hAnsi="Times New Roman"/>
+          <w:highlight w:val="green"/>
+        </w:rPr>
+        <w:t>The 67% precision reported for v3 in WP3 is not directly comparable with the precision above: it was measured on a different version, on a sample drawn from that version's output, and before the guideline rulings were finalised.</w:t>
       </w:r>
     </w:p>
     <w:tbl>

</xml_diff>

<commit_message>
Rebuild review copy: clear earlier revisions' highlighting, single legend, consistent marks
Co-Authored-By: Claude Opus 5 <noreply@anthropic.com>
</commit_message>
<xml_diff>
--- a/paper/GreenBERT_Project_Report_v3_REVIEW.docx
+++ b/paper/GreenBERT_Project_Report_v3_REVIEW.docx
@@ -58,7 +58,7 @@
           <w:i w:val="1"/>
           <w:iCs w:val="1"/>
           <w:strike/>
-          <w:color w:val="B00000"/>
+          <w:color w:val="808080"/>
           <w:sz w:val="18"/>
           <w:szCs w:val="18"/>
           <w:rtl w:val="0"/>
@@ -70,10 +70,9 @@
           <w:i w:val="1"/>
           <w:iCs w:val="1"/>
           <w:strike/>
-          <w:color w:val="B00000"/>
+          <w:color w:val="808080"/>
           <w:sz w:val="18"/>
           <w:szCs w:val="18"/>
-          <w:highlight w:val="green"/>
           <w:rtl w:val="0"/>
         </w:rPr>
         <w:t xml:space="preserve">green = new text added</w:t>
@@ -83,7 +82,7 @@
           <w:i w:val="1"/>
           <w:iCs w:val="1"/>
           <w:strike/>
-          <w:color w:val="B00000"/>
+          <w:color w:val="808080"/>
           <w:sz w:val="18"/>
           <w:szCs w:val="18"/>
           <w:rtl w:val="0"/>
@@ -95,10 +94,9 @@
           <w:i w:val="1"/>
           <w:iCs w:val="1"/>
           <w:strike/>
-          <w:color w:val="B00000"/>
+          <w:color w:val="808080"/>
           <w:sz w:val="18"/>
           <w:szCs w:val="18"/>
-          <w:highlight w:val="yellow"/>
           <w:rtl w:val="0"/>
         </w:rPr>
         <w:t xml:space="preserve">yellow = provisional; will change after the expanded 100-claim review is completed (currently based on the 26-claim sample)</w:t>
@@ -106,7 +104,7 @@
       <w:r>
         <w:rPr>
           <w:strike/>
-          <w:color w:val="B00000"/>
+          <w:color w:val="808080"/>
           <w:rtl w:val="0"/>
         </w:rPr>
       </w:r>
@@ -117,36 +115,33 @@
           <w:rFonts w:ascii="Times New Roman" w:hAnsi="Times New Roman"/>
           <w:highlight w:val="green"/>
         </w:rPr>
-        <w:t>Colour key: no highlight = existing report text | green = new text added | yellow = provisional figure from a small sample | red highlight = assumed value awaiting the human labels.</w:t>
-      </w:r>
-    </w:p>
-    <w:p>
+        <w:t xml:space="preserve">Review copy. Plain text is unchanged. GREEN = text added or rewritten in this revision. </w:t>
+      </w:r>
       <w:r>
         <w:rPr>
           <w:rFonts w:ascii="Times New Roman" w:hAnsi="Times New Roman"/>
-          <w:highlight w:val="green"/>
-        </w:rPr>
-        <w:t xml:space="preserve">Review copy legend: green = new text; </w:t>
-      </w:r>
-      <w:r>
-        <w:rPr>
-          <w:rFonts w:ascii="Times New Roman" w:hAnsi="Times New Roman"/>
-        </w:rPr>
-        <w:t xml:space="preserve">red strikethrough = removed from this location (moved to WP3 or held for WP5); </w:t>
+        </w:rPr>
+        <w:t xml:space="preserve">Grey strikethrough = removed from this location (moved to WP3, or held for WP5). </w:t>
       </w:r>
       <w:r>
         <w:rPr>
           <w:rFonts w:ascii="Times New Roman" w:hAnsi="Times New Roman"/>
           <w:highlight w:val="red"/>
         </w:rPr>
-        <w:t>red highlight = assumed value, to be replaced by the actual human labels</w:t>
+        <w:t xml:space="preserve">RED = assumed value, to be replaced by the actual human labels. </w:t>
       </w:r>
       <w:r>
         <w:rPr>
           <w:rFonts w:ascii="Times New Roman" w:hAnsi="Times New Roman"/>
-          <w:highlight w:val="green"/>
-        </w:rPr>
-        <w:t>; yellow = provisional small-sample figure.</w:t>
+          <w:highlight w:val="yellow"/>
+        </w:rPr>
+        <w:t>YELLOW = provisional figure from a small sample.</w:t>
+      </w:r>
+      <w:r>
+        <w:rPr>
+          <w:rFonts w:ascii="Times New Roman" w:hAnsi="Times New Roman"/>
+        </w:rPr>
+        <w:t xml:space="preserve"> All highlighting from earlier revisions has been cleared so that only this revision's changes are marked.</w:t>
       </w:r>
     </w:p>
     <w:p>
@@ -3304,6 +3299,7 @@
       </w:r>
       <w:commentRangeEnd w:id="0"/>
       <w:r>
+        <w:rPr/>
         <w:commentReference w:id="0"/>
       </w:r>
       <w:r>
@@ -3839,7 +3835,6 @@
           <w:bCs w:val="0"/>
           <w:i w:val="0"/>
           <w:iCs w:val="0"/>
-          <w:highlight w:val="green"/>
           <w:rtl w:val="0"/>
         </w:rPr>
         <w:t xml:space="preserve">Each error category identified in WP2.5 was translated into a targeted refinement of the engine, producing versions v2 and v3. The refinements fall into four groups.</w:t>
@@ -3855,93 +3850,89 @@
         <w:rPr/>
       </w:pPr>
       <w:r>
+        <w:rPr>
+          <w:b w:val="0"/>
+          <w:bCs w:val="0"/>
+          <w:i w:val="0"/>
+          <w:iCs w:val="0"/>
+          <w:rtl w:val="0"/>
+        </w:rPr>
+        <w:t xml:space="preserve">First, detection was decoupled from the environmental topic gate. The v1 system behaved as an environmental-claim extractor: a sentence could only enter the pipeline through an environmental keyword, so purely Social or Governance claims were invisible and the ESG-type label was, in effect, hard-coded. In v2 the topic gate was widened to the union of Environmental, Social, and Governance vocabularies, and the ESG type became a genuinely classified attribute of each claim rather than a precondition for finding it.</w:t>
+      </w:r>
+      <w:r>
+        <w:rPr>
+          <w:rtl w:val="0"/>
+        </w:rPr>
+      </w:r>
+    </w:p>
+    <w:p>
+      <w:pPr>
+        <w:rPr/>
+      </w:pPr>
+      <w:r>
+        <w:rPr>
+          <w:b w:val="0"/>
+          <w:bCs w:val="0"/>
+          <w:i w:val="0"/>
+          <w:iCs w:val="0"/>
+          <w:rtl w:val="0"/>
+        </w:rPr>
+        <w:t xml:space="preserve">Second, dedicated non-claim filters were added for each false-positive category identified in WP2.5. Methodology and definition filters remove sentences that describe how figures are calculated or defined ("is calculated using", "is defined as", "in accordance with"), together with sentences describing mandatory ESRS reporting elements such as materiality assessments, impact-risk-opportunity (IRO) statements, and disclosure structure. General-statement filters remove opinion sentences such as "is critical" or "global challenge", and are applied only when the sentence contains no hard quantity. Risk-description filters remove sentences that describe risks or dependencies ("vulnerable to", "dependent on", "physical risk"). Governance filters remove committee, board, and remuneration sentences that carry no quantity. Activity filters remove reports of events and memberships ("co-hosted", "signed the", "member of"). Finally, navigation filters remove cross-references and running headers ("see page", "the table below").</w:t>
+      </w:r>
+      <w:r>
+        <w:rPr>
+          <w:rtl w:val="0"/>
+        </w:rPr>
+      </w:r>
+    </w:p>
+    <w:p>
+      <w:pPr>
+        <w:rPr/>
+      </w:pPr>
+      <w:r>
+        <w:rPr>
+          <w:b w:val="0"/>
+          <w:bCs w:val="0"/>
+          <w:i w:val="0"/>
+          <w:iCs w:val="0"/>
+          <w:rtl w:val="0"/>
+        </w:rPr>
+        <w:t xml:space="preserve">Third, ESG-type assignment was made context-aware. Governance terms (board, committee, audit, remuneration) are given priority in ambiguous cases, so that a committee-centred sentence is labelled Governance even when it mentions "sustainability". Lexical ambiguity is handled explicitly: "environment" in "a safe working environment" is treated as Social rather than Environmental, and "nature" in "the nature of our business" is excluded from the environmental count. Both are cases in which a keyword’s surface form diverges from its meaning.</w:t>
+      </w:r>
+      <w:r>
+        <w:rPr>
+          <w:rtl w:val="0"/>
+        </w:rPr>
+      </w:r>
+    </w:p>
+    <w:p>
+      <w:pPr>
+        <w:rPr/>
+      </w:pPr>
+      <w:r>
+        <w:rPr>
+          <w:b w:val="0"/>
+          <w:bCs w:val="0"/>
+          <w:i w:val="0"/>
+          <w:iCs w:val="0"/>
+          <w:rtl w:val="0"/>
+        </w:rPr>
+        <w:t xml:space="preserve">Fourth, the evidence and risk columns were made independent of the claim type. In v1, evidence was derived mechanically from claim type (Strong yields Yes, Vague yields No), which validation showed to be wrong in both directions: a vague claim can cite a credible external standard, and a forward-looking promise can carry a projected number that is not evidence of anything achieved. In v3, evidence is assessed on its own signals: an achieved quantity yields Yes; a citation of a standard or assurance provider, or a merely projected quantity, yields Partial; neither yields No. The risk signal is then derived from the claim-type and evidence combination, whose high-risk cells (unsubstantiated future promises and unsupported vague claims) are precisely the greenwashing indicators of interest.</w:t>
+      </w:r>
+      <w:r>
+        <w:rPr>
+          <w:rtl w:val="0"/>
+        </w:rPr>
+      </w:r>
+    </w:p>
+    <w:p>
+      <w:pPr>
         <w:rPr>
           <w:b w:val="0"/>
           <w:bCs w:val="0"/>
           <w:i w:val="0"/>
           <w:iCs w:val="0"/>
           <w:highlight w:val="green"/>
-          <w:rtl w:val="0"/>
-        </w:rPr>
-        <w:t xml:space="preserve">First, detection was decoupled from the environmental topic gate. The v1 system behaved as an environmental-claim extractor: a sentence could only enter the pipeline through an environmental keyword, so purely Social or Governance claims were invisible and the ESG-type label was, in effect, hard-coded. In v2 the topic gate was widened to the union of Environmental, Social, and Governance vocabularies, and the ESG type became a genuinely classified attribute of each claim rather than a precondition for finding it.</w:t>
-      </w:r>
-      <w:r>
-        <w:rPr>
-          <w:rtl w:val="0"/>
-        </w:rPr>
-      </w:r>
-    </w:p>
-    <w:p>
-      <w:pPr>
-        <w:rPr/>
-      </w:pPr>
-      <w:r>
-        <w:rPr>
-          <w:b w:val="0"/>
-          <w:bCs w:val="0"/>
-          <w:i w:val="0"/>
-          <w:iCs w:val="0"/>
-          <w:highlight w:val="green"/>
-          <w:rtl w:val="0"/>
-        </w:rPr>
-        <w:t xml:space="preserve">Second, dedicated non-claim filters were added for each false-positive category identified in WP2.5. Methodology and definition filters remove sentences that describe how figures are calculated or defined ("is calculated using", "is defined as", "in accordance with"), together with sentences describing mandatory ESRS reporting elements such as materiality assessments, impact-risk-opportunity (IRO) statements, and disclosure structure. General-statement filters remove opinion sentences such as "is critical" or "global challenge", and are applied only when the sentence contains no hard quantity. Risk-description filters remove sentences that describe risks or dependencies ("vulnerable to", "dependent on", "physical risk"). Governance filters remove committee, board, and remuneration sentences that carry no quantity. Activity filters remove reports of events and memberships ("co-hosted", "signed the", "member of"). Finally, navigation filters remove cross-references and running headers ("see page", "the table below").</w:t>
-      </w:r>
-      <w:r>
-        <w:rPr>
-          <w:rtl w:val="0"/>
-        </w:rPr>
-      </w:r>
-    </w:p>
-    <w:p>
-      <w:pPr>
-        <w:rPr/>
-      </w:pPr>
-      <w:r>
-        <w:rPr>
-          <w:b w:val="0"/>
-          <w:bCs w:val="0"/>
-          <w:i w:val="0"/>
-          <w:iCs w:val="0"/>
-          <w:highlight w:val="green"/>
-          <w:rtl w:val="0"/>
-        </w:rPr>
-        <w:t xml:space="preserve">Third, ESG-type assignment was made context-aware. Governance terms (board, committee, audit, remuneration) are given priority in ambiguous cases, so that a committee-centred sentence is labelled Governance even when it mentions "sustainability". Lexical ambiguity is handled explicitly: "environment" in "a safe working environment" is treated as Social rather than Environmental, and "nature" in "the nature of our business" is excluded from the environmental count. Both are cases in which a keyword’s surface form diverges from its meaning.</w:t>
-      </w:r>
-      <w:r>
-        <w:rPr>
-          <w:rtl w:val="0"/>
-        </w:rPr>
-      </w:r>
-    </w:p>
-    <w:p>
-      <w:pPr>
-        <w:rPr/>
-      </w:pPr>
-      <w:r>
-        <w:rPr>
-          <w:b w:val="0"/>
-          <w:bCs w:val="0"/>
-          <w:i w:val="0"/>
-          <w:iCs w:val="0"/>
-          <w:highlight w:val="green"/>
-          <w:rtl w:val="0"/>
-        </w:rPr>
-        <w:t xml:space="preserve">Fourth, the evidence and risk columns were made independent of the claim type. In v1, evidence was derived mechanically from claim type (Strong yields Yes, Vague yields No), which validation showed to be wrong in both directions: a vague claim can cite a credible external standard, and a forward-looking promise can carry a projected number that is not evidence of anything achieved. In v3, evidence is assessed on its own signals: an achieved quantity yields Yes; a citation of a standard or assurance provider, or a merely projected quantity, yields Partial; neither yields No. The risk signal is then derived from the claim-type and evidence combination, whose high-risk cells (unsubstantiated future promises and unsupported vague claims) are precisely the greenwashing indicators of interest.</w:t>
-      </w:r>
-      <w:r>
-        <w:rPr>
-          <w:rtl w:val="0"/>
-        </w:rPr>
-      </w:r>
-    </w:p>
-    <w:p>
-      <w:pPr>
-        <w:rPr>
-          <w:b w:val="0"/>
-          <w:bCs w:val="0"/>
-          <w:i w:val="0"/>
-          <w:iCs w:val="0"/>
-          <w:highlight w:val="green"/>
         </w:rPr>
       </w:pPr>
       <w:r>
@@ -3951,8 +3942,7 @@
           <w:i w:val="0"/>
           <w:iCs w:val="0"/>
           <w:strike/>
-          <w:color w:val="B00000"/>
-          <w:highlight w:val="green"/>
+          <w:color w:val="808080"/>
           <w:rtl w:val="0"/>
         </w:rPr>
         <w:t xml:space="preserve">In its final version, the engine processes the two evaluation reports (119 pages, approximately 2,850 sentences) into 582 candidate claims (416 for Unilever and 166 for Keurig Dr Pepper), each carrying its page number, ESG type, claim type, evidence level, and risk signal, with per-filter drop counts reported for transparency.</w:t>
@@ -3975,7 +3965,6 @@
       </w:pPr>
       <w:r>
         <w:rPr>
-          <w:highlight w:val="green"/>
           <w:rtl w:val="0"/>
         </w:rPr>
         <w:t xml:space="preserve">These refinements transformed the initial environmental claim extractor into a general ESG claim extraction engine capable of detecting Environmental, Social, and Governance claims while substantially reducing systematic false positives. </w:t>
@@ -4073,7 +4062,8 @@
               <w:rPr>
                 <w:b w:val="1"/>
                 <w:bCs w:val="1"/>
-                <w:color w:val="ffffff"/>
+                <w:strike w:val="0"/>
+                <w:color w:val="000000"/>
                 <w:highlight w:val="green"/>
                 <w:rtl w:val="0"/>
               </w:rPr>
@@ -4081,6 +4071,8 @@
             </w:r>
             <w:r>
               <w:rPr>
+                <w:strike w:val="0"/>
+                <w:color w:val="000000"/>
                 <w:highlight w:val="green"/>
                 <w:rtl w:val="0"/>
               </w:rPr>
@@ -4119,7 +4111,8 @@
               <w:rPr>
                 <w:b w:val="1"/>
                 <w:bCs w:val="1"/>
-                <w:color w:val="ffffff"/>
+                <w:strike w:val="0"/>
+                <w:color w:val="000000"/>
                 <w:highlight w:val="green"/>
                 <w:rtl w:val="0"/>
               </w:rPr>
@@ -4127,6 +4120,8 @@
             </w:r>
             <w:r>
               <w:rPr>
+                <w:strike w:val="0"/>
+                <w:color w:val="000000"/>
                 <w:highlight w:val="green"/>
                 <w:rtl w:val="0"/>
               </w:rPr>
@@ -4165,7 +4160,8 @@
               <w:rPr>
                 <w:b w:val="1"/>
                 <w:bCs w:val="1"/>
-                <w:color w:val="ffffff"/>
+                <w:strike w:val="0"/>
+                <w:color w:val="000000"/>
                 <w:highlight w:val="green"/>
                 <w:rtl w:val="0"/>
               </w:rPr>
@@ -4173,6 +4169,8 @@
             </w:r>
             <w:r>
               <w:rPr>
+                <w:strike w:val="0"/>
+                <w:color w:val="000000"/>
                 <w:highlight w:val="green"/>
                 <w:rtl w:val="0"/>
               </w:rPr>
@@ -4211,7 +4209,8 @@
               <w:rPr>
                 <w:b w:val="1"/>
                 <w:bCs w:val="1"/>
-                <w:color w:val="ffffff"/>
+                <w:strike w:val="0"/>
+                <w:color w:val="000000"/>
                 <w:highlight w:val="green"/>
                 <w:rtl w:val="0"/>
               </w:rPr>
@@ -4219,6 +4218,8 @@
             </w:r>
             <w:r>
               <w:rPr>
+                <w:strike w:val="0"/>
+                <w:color w:val="000000"/>
                 <w:highlight w:val="green"/>
                 <w:rtl w:val="0"/>
               </w:rPr>
@@ -4257,7 +4258,8 @@
               <w:rPr>
                 <w:b w:val="1"/>
                 <w:bCs w:val="1"/>
-                <w:color w:val="ffffff"/>
+                <w:strike w:val="0"/>
+                <w:color w:val="000000"/>
                 <w:highlight w:val="green"/>
                 <w:rtl w:val="0"/>
               </w:rPr>
@@ -4265,6 +4267,8 @@
             </w:r>
             <w:r>
               <w:rPr>
+                <w:strike w:val="0"/>
+                <w:color w:val="000000"/>
                 <w:highlight w:val="green"/>
                 <w:rtl w:val="0"/>
               </w:rPr>
@@ -4303,7 +4307,8 @@
               <w:rPr>
                 <w:b w:val="1"/>
                 <w:bCs w:val="1"/>
-                <w:color w:val="ffffff"/>
+                <w:strike w:val="0"/>
+                <w:color w:val="000000"/>
                 <w:highlight w:val="green"/>
                 <w:rtl w:val="0"/>
               </w:rPr>
@@ -4311,6 +4316,8 @@
             </w:r>
             <w:r>
               <w:rPr>
+                <w:strike w:val="0"/>
+                <w:color w:val="000000"/>
                 <w:highlight w:val="green"/>
                 <w:rtl w:val="0"/>
               </w:rPr>
@@ -4349,7 +4356,8 @@
               <w:rPr>
                 <w:b w:val="1"/>
                 <w:bCs w:val="1"/>
-                <w:color w:val="ffffff"/>
+                <w:strike w:val="0"/>
+                <w:color w:val="000000"/>
                 <w:highlight w:val="green"/>
                 <w:rtl w:val="0"/>
               </w:rPr>
@@ -4357,6 +4365,8 @@
             </w:r>
             <w:r>
               <w:rPr>
+                <w:strike w:val="0"/>
+                <w:color w:val="000000"/>
                 <w:highlight w:val="green"/>
                 <w:rtl w:val="0"/>
               </w:rPr>
@@ -4399,6 +4409,8 @@
             </w:pPr>
             <w:r>
               <w:rPr>
+                <w:strike w:val="0"/>
+                <w:color w:val="000000"/>
                 <w:highlight w:val="green"/>
                 <w:rtl w:val="0"/>
               </w:rPr>
@@ -4406,6 +4418,8 @@
             </w:r>
             <w:r>
               <w:rPr>
+                <w:strike w:val="0"/>
+                <w:color w:val="000000"/>
                 <w:highlight w:val="green"/>
                 <w:rtl w:val="0"/>
               </w:rPr>
@@ -4441,6 +4455,8 @@
             </w:pPr>
             <w:r>
               <w:rPr>
+                <w:strike w:val="0"/>
+                <w:color w:val="000000"/>
                 <w:highlight w:val="green"/>
                 <w:rtl w:val="0"/>
               </w:rPr>
@@ -4448,6 +4464,8 @@
             </w:r>
             <w:r>
               <w:rPr>
+                <w:strike w:val="0"/>
+                <w:color w:val="000000"/>
                 <w:highlight w:val="green"/>
                 <w:rtl w:val="0"/>
               </w:rPr>
@@ -4483,6 +4501,8 @@
             </w:pPr>
             <w:r>
               <w:rPr>
+                <w:strike w:val="0"/>
+                <w:color w:val="000000"/>
                 <w:highlight w:val="green"/>
                 <w:rtl w:val="0"/>
               </w:rPr>
@@ -4490,6 +4510,8 @@
             </w:r>
             <w:r>
               <w:rPr>
+                <w:strike w:val="0"/>
+                <w:color w:val="000000"/>
                 <w:highlight w:val="green"/>
                 <w:rtl w:val="0"/>
               </w:rPr>
@@ -4525,6 +4547,8 @@
             </w:pPr>
             <w:r>
               <w:rPr>
+                <w:strike w:val="0"/>
+                <w:color w:val="000000"/>
                 <w:highlight w:val="green"/>
                 <w:rtl w:val="0"/>
               </w:rPr>
@@ -4532,6 +4556,8 @@
             </w:r>
             <w:r>
               <w:rPr>
+                <w:strike w:val="0"/>
+                <w:color w:val="000000"/>
                 <w:highlight w:val="green"/>
                 <w:rtl w:val="0"/>
               </w:rPr>
@@ -4567,6 +4593,8 @@
             </w:pPr>
             <w:r>
               <w:rPr>
+                <w:strike w:val="0"/>
+                <w:color w:val="000000"/>
                 <w:highlight w:val="green"/>
                 <w:rtl w:val="0"/>
               </w:rPr>
@@ -4574,6 +4602,8 @@
             </w:r>
             <w:r>
               <w:rPr>
+                <w:strike w:val="0"/>
+                <w:color w:val="000000"/>
                 <w:highlight w:val="green"/>
                 <w:rtl w:val="0"/>
               </w:rPr>
@@ -4610,6 +4640,8 @@
             </w:pPr>
             <w:r>
               <w:rPr>
+                <w:strike w:val="0"/>
+                <w:color w:val="000000"/>
                 <w:highlight w:val="green"/>
                 <w:rtl w:val="0"/>
               </w:rPr>
@@ -4617,6 +4649,8 @@
             </w:r>
             <w:r>
               <w:rPr>
+                <w:strike w:val="0"/>
+                <w:color w:val="000000"/>
                 <w:highlight w:val="green"/>
                 <w:rtl w:val="0"/>
               </w:rPr>
@@ -4653,6 +4687,8 @@
             </w:pPr>
             <w:r>
               <w:rPr>
+                <w:strike w:val="0"/>
+                <w:color w:val="000000"/>
                 <w:highlight w:val="green"/>
                 <w:rtl w:val="0"/>
               </w:rPr>
@@ -4660,6 +4696,8 @@
             </w:r>
             <w:r>
               <w:rPr>
+                <w:strike w:val="0"/>
+                <w:color w:val="000000"/>
                 <w:highlight w:val="green"/>
                 <w:rtl w:val="0"/>
               </w:rPr>
@@ -4702,6 +4740,8 @@
             </w:pPr>
             <w:r>
               <w:rPr>
+                <w:strike w:val="0"/>
+                <w:color w:val="000000"/>
                 <w:highlight w:val="green"/>
                 <w:rtl w:val="0"/>
               </w:rPr>
@@ -4709,6 +4749,8 @@
             </w:r>
             <w:r>
               <w:rPr>
+                <w:strike w:val="0"/>
+                <w:color w:val="000000"/>
                 <w:highlight w:val="green"/>
                 <w:rtl w:val="0"/>
               </w:rPr>
@@ -4744,6 +4786,8 @@
             </w:pPr>
             <w:r>
               <w:rPr>
+                <w:strike w:val="0"/>
+                <w:color w:val="000000"/>
                 <w:highlight w:val="green"/>
                 <w:rtl w:val="0"/>
               </w:rPr>
@@ -4751,6 +4795,8 @@
             </w:r>
             <w:r>
               <w:rPr>
+                <w:strike w:val="0"/>
+                <w:color w:val="000000"/>
                 <w:highlight w:val="green"/>
                 <w:rtl w:val="0"/>
               </w:rPr>
@@ -4786,6 +4832,8 @@
             </w:pPr>
             <w:r>
               <w:rPr>
+                <w:strike w:val="0"/>
+                <w:color w:val="000000"/>
                 <w:highlight w:val="green"/>
                 <w:rtl w:val="0"/>
               </w:rPr>
@@ -4793,6 +4841,8 @@
             </w:r>
             <w:r>
               <w:rPr>
+                <w:strike w:val="0"/>
+                <w:color w:val="000000"/>
                 <w:highlight w:val="green"/>
                 <w:rtl w:val="0"/>
               </w:rPr>
@@ -4828,6 +4878,8 @@
             </w:pPr>
             <w:r>
               <w:rPr>
+                <w:strike w:val="0"/>
+                <w:color w:val="000000"/>
                 <w:highlight w:val="green"/>
                 <w:rtl w:val="0"/>
               </w:rPr>
@@ -4835,6 +4887,8 @@
             </w:r>
             <w:r>
               <w:rPr>
+                <w:strike w:val="0"/>
+                <w:color w:val="000000"/>
                 <w:highlight w:val="green"/>
                 <w:rtl w:val="0"/>
               </w:rPr>
@@ -4870,6 +4924,8 @@
             </w:pPr>
             <w:r>
               <w:rPr>
+                <w:strike w:val="0"/>
+                <w:color w:val="000000"/>
                 <w:highlight w:val="green"/>
                 <w:rtl w:val="0"/>
               </w:rPr>
@@ -4877,6 +4933,8 @@
             </w:r>
             <w:r>
               <w:rPr>
+                <w:strike w:val="0"/>
+                <w:color w:val="000000"/>
                 <w:highlight w:val="green"/>
                 <w:rtl w:val="0"/>
               </w:rPr>
@@ -4913,6 +4971,8 @@
             </w:pPr>
             <w:r>
               <w:rPr>
+                <w:strike w:val="0"/>
+                <w:color w:val="000000"/>
                 <w:highlight w:val="green"/>
                 <w:rtl w:val="0"/>
               </w:rPr>
@@ -4920,6 +4980,8 @@
             </w:r>
             <w:r>
               <w:rPr>
+                <w:strike w:val="0"/>
+                <w:color w:val="000000"/>
                 <w:highlight w:val="green"/>
                 <w:rtl w:val="0"/>
               </w:rPr>
@@ -4956,6 +5018,8 @@
             </w:pPr>
             <w:r>
               <w:rPr>
+                <w:strike w:val="0"/>
+                <w:color w:val="000000"/>
                 <w:highlight w:val="green"/>
                 <w:rtl w:val="0"/>
               </w:rPr>
@@ -4963,6 +5027,8 @@
             </w:r>
             <w:r>
               <w:rPr>
+                <w:strike w:val="0"/>
+                <w:color w:val="000000"/>
                 <w:highlight w:val="green"/>
                 <w:rtl w:val="0"/>
               </w:rPr>
@@ -5005,6 +5071,8 @@
             </w:pPr>
             <w:r>
               <w:rPr>
+                <w:strike w:val="0"/>
+                <w:color w:val="000000"/>
                 <w:highlight w:val="green"/>
                 <w:rtl w:val="0"/>
               </w:rPr>
@@ -5012,6 +5080,8 @@
             </w:r>
             <w:r>
               <w:rPr>
+                <w:strike w:val="0"/>
+                <w:color w:val="000000"/>
                 <w:highlight w:val="green"/>
                 <w:rtl w:val="0"/>
               </w:rPr>
@@ -5047,6 +5117,8 @@
             </w:pPr>
             <w:r>
               <w:rPr>
+                <w:strike w:val="0"/>
+                <w:color w:val="000000"/>
                 <w:highlight w:val="green"/>
                 <w:rtl w:val="0"/>
               </w:rPr>
@@ -5054,6 +5126,8 @@
             </w:r>
             <w:r>
               <w:rPr>
+                <w:strike w:val="0"/>
+                <w:color w:val="000000"/>
                 <w:highlight w:val="green"/>
                 <w:rtl w:val="0"/>
               </w:rPr>
@@ -5089,6 +5163,8 @@
             </w:pPr>
             <w:r>
               <w:rPr>
+                <w:strike w:val="0"/>
+                <w:color w:val="000000"/>
                 <w:highlight w:val="green"/>
                 <w:rtl w:val="0"/>
               </w:rPr>
@@ -5096,6 +5172,8 @@
             </w:r>
             <w:r>
               <w:rPr>
+                <w:strike w:val="0"/>
+                <w:color w:val="000000"/>
                 <w:highlight w:val="green"/>
                 <w:rtl w:val="0"/>
               </w:rPr>
@@ -5131,6 +5209,8 @@
             </w:pPr>
             <w:r>
               <w:rPr>
+                <w:strike w:val="0"/>
+                <w:color w:val="000000"/>
                 <w:highlight w:val="green"/>
                 <w:rtl w:val="0"/>
               </w:rPr>
@@ -5138,6 +5218,8 @@
             </w:r>
             <w:r>
               <w:rPr>
+                <w:strike w:val="0"/>
+                <w:color w:val="000000"/>
                 <w:highlight w:val="green"/>
                 <w:rtl w:val="0"/>
               </w:rPr>
@@ -5173,6 +5255,8 @@
             </w:pPr>
             <w:r>
               <w:rPr>
+                <w:strike w:val="0"/>
+                <w:color w:val="000000"/>
                 <w:highlight w:val="green"/>
                 <w:rtl w:val="0"/>
               </w:rPr>
@@ -5180,6 +5264,8 @@
             </w:r>
             <w:r>
               <w:rPr>
+                <w:strike w:val="0"/>
+                <w:color w:val="000000"/>
                 <w:highlight w:val="green"/>
                 <w:rtl w:val="0"/>
               </w:rPr>
@@ -5216,6 +5302,8 @@
             </w:pPr>
             <w:r>
               <w:rPr>
+                <w:strike w:val="0"/>
+                <w:color w:val="000000"/>
                 <w:highlight w:val="green"/>
                 <w:rtl w:val="0"/>
               </w:rPr>
@@ -5223,6 +5311,8 @@
             </w:r>
             <w:r>
               <w:rPr>
+                <w:strike w:val="0"/>
+                <w:color w:val="000000"/>
                 <w:highlight w:val="green"/>
                 <w:rtl w:val="0"/>
               </w:rPr>
@@ -5259,6 +5349,8 @@
             </w:pPr>
             <w:r>
               <w:rPr>
+                <w:strike w:val="0"/>
+                <w:color w:val="000000"/>
                 <w:highlight w:val="green"/>
                 <w:rtl w:val="0"/>
               </w:rPr>
@@ -5266,6 +5358,8 @@
             </w:r>
             <w:r>
               <w:rPr>
+                <w:strike w:val="0"/>
+                <w:color w:val="000000"/>
                 <w:highlight w:val="green"/>
                 <w:rtl w:val="0"/>
               </w:rPr>
@@ -5372,7 +5466,7 @@
           <w:iCs w:val="0"/>
           <w:smallCaps w:val="0"/>
           <w:strike/>
-          <w:color w:val="B00000"/>
+          <w:color w:val="808080"/>
           <w:sz w:val="22"/>
           <w:szCs w:val="22"/>
           <w:u w:val="none"/>
@@ -5415,7 +5509,7 @@
           <w:iCs w:val="0"/>
           <w:smallCaps w:val="0"/>
           <w:strike/>
-          <w:color w:val="B00000"/>
+          <w:color w:val="808080"/>
           <w:sz w:val="22"/>
           <w:szCs w:val="22"/>
           <w:u w:val="none"/>
@@ -5555,7 +5649,7 @@
       <w:r>
         <w:rPr>
           <w:strike/>
-          <w:color w:val="B00000"/>
+          <w:color w:val="808080"/>
         </w:rPr>
         <w:commentReference w:id="1"/>
       </w:r>
@@ -5563,14 +5657,14 @@
       <w:r>
         <w:rPr>
           <w:strike/>
-          <w:color w:val="B00000"/>
+          <w:color w:val="808080"/>
         </w:rPr>
         <w:commentReference w:id="2"/>
       </w:r>
       <w:r>
         <w:rPr>
           <w:strike/>
-          <w:color w:val="B00000"/>
+          <w:color w:val="808080"/>
           <w:rtl w:val="0"/>
         </w:rPr>
         <w:t xml:space="preserve">Activity 4.1 – Benchmark Dataset Construction</w:t>
@@ -5578,7 +5672,7 @@
       <w:r>
         <w:rPr>
           <w:strike/>
-          <w:color w:val="B00000"/>
+          <w:color w:val="808080"/>
           <w:rtl w:val="0"/>
         </w:rPr>
       </w:r>
@@ -5590,8 +5684,7 @@
       <w:r>
         <w:rPr>
           <w:strike/>
-          <w:color w:val="B00000"/>
-          <w:highlight w:val="yellow"/>
+          <w:color w:val="808080"/>
           <w:rtl w:val="0"/>
         </w:rPr>
         <w:t xml:space="preserve">The current human benchmark consists of 26 dual-annotated candidates from two reports. This is sufficient for development but too small for statistically robust evaluation; the benchmark is therefore being expanded to 100 human-labelled claims, sampled across different companies, sectors, and ESG types, using the same two-annotator protocol and guideline from WP1.5. All evaluation figures below that depend on the 26-claim sample are provisional and will be recomputed on the full benchmark.</w:t>
@@ -5599,7 +5692,7 @@
       <w:r>
         <w:rPr>
           <w:strike/>
-          <w:color w:val="B00000"/>
+          <w:color w:val="808080"/>
           <w:rtl w:val="0"/>
         </w:rPr>
       </w:r>
@@ -5654,7 +5747,7 @@
       <w:r>
         <w:rPr>
           <w:strike/>
-          <w:color w:val="B00000"/>
+          <w:color w:val="808080"/>
           <w:rtl w:val="0"/>
         </w:rPr>
         <w:t xml:space="preserve">Activity 4.2 – Claim Extraction Evaluation</w:t>
@@ -5662,7 +5755,7 @@
       <w:r>
         <w:rPr>
           <w:strike/>
-          <w:color w:val="B00000"/>
+          <w:color w:val="808080"/>
           <w:rtl w:val="0"/>
         </w:rPr>
       </w:r>
@@ -5675,7 +5768,7 @@
       <w:r>
         <w:rPr>
           <w:strike/>
-          <w:color w:val="B00000"/>
+          <w:color w:val="808080"/>
           <w:rtl w:val="0"/>
         </w:rPr>
         <w:t xml:space="preserve">On the development sample, the three engine versions were scored against the human labels. Precision rose from 42% (v1) to 69% (v2) and 92% (v3), while recall of genuine claims remained at 100% throughout; no true claim was lost to any filter. The gains therefore came entirely from removing false positives, not from discarding real content.</w:t>
@@ -5689,7 +5782,7 @@
       <w:r>
         <w:rPr>
           <w:strike/>
-          <w:color w:val="B00000"/>
+          <w:color w:val="808080"/>
           <w:rtl w:val="0"/>
         </w:rPr>
         <w:t xml:space="preserve">Table 2. Per-iteration counts and accuracy on the 26-candidate human development sample.</w:t>
@@ -5770,7 +5863,7 @@
                 <w:b w:val="1"/>
                 <w:bCs w:val="1"/>
                 <w:strike/>
-                <w:color w:val="B00000"/>
+                <w:color w:val="808080"/>
                 <w:rtl w:val="0"/>
               </w:rPr>
               <w:t xml:space="preserve">Version</w:t>
@@ -5778,7 +5871,7 @@
             <w:r>
               <w:rPr>
                 <w:strike/>
-                <w:color w:val="B00000"/>
+                <w:color w:val="808080"/>
                 <w:rtl w:val="0"/>
               </w:rPr>
             </w:r>
@@ -5817,7 +5910,7 @@
                 <w:b w:val="1"/>
                 <w:bCs w:val="1"/>
                 <w:strike/>
-                <w:color w:val="B00000"/>
+                <w:color w:val="808080"/>
                 <w:rtl w:val="0"/>
               </w:rPr>
               <w:t xml:space="preserve">Candidates</w:t>
@@ -5825,7 +5918,7 @@
             <w:r>
               <w:rPr>
                 <w:strike/>
-                <w:color w:val="B00000"/>
+                <w:color w:val="808080"/>
                 <w:rtl w:val="0"/>
               </w:rPr>
             </w:r>
@@ -5864,7 +5957,7 @@
                 <w:b w:val="1"/>
                 <w:bCs w:val="1"/>
                 <w:strike/>
-                <w:color w:val="B00000"/>
+                <w:color w:val="808080"/>
                 <w:rtl w:val="0"/>
               </w:rPr>
               <w:t xml:space="preserve">True claims</w:t>
@@ -5872,7 +5965,7 @@
             <w:r>
               <w:rPr>
                 <w:strike/>
-                <w:color w:val="B00000"/>
+                <w:color w:val="808080"/>
                 <w:rtl w:val="0"/>
               </w:rPr>
             </w:r>
@@ -5911,7 +6004,7 @@
                 <w:b w:val="1"/>
                 <w:bCs w:val="1"/>
                 <w:strike/>
-                <w:color w:val="B00000"/>
+                <w:color w:val="808080"/>
                 <w:rtl w:val="0"/>
               </w:rPr>
               <w:t xml:space="preserve">False positives</w:t>
@@ -5919,7 +6012,7 @@
             <w:r>
               <w:rPr>
                 <w:strike/>
-                <w:color w:val="B00000"/>
+                <w:color w:val="808080"/>
                 <w:rtl w:val="0"/>
               </w:rPr>
             </w:r>
@@ -5958,7 +6051,7 @@
                 <w:b w:val="1"/>
                 <w:bCs w:val="1"/>
                 <w:strike/>
-                <w:color w:val="B00000"/>
+                <w:color w:val="808080"/>
                 <w:rtl w:val="0"/>
               </w:rPr>
               <w:t xml:space="preserve">False negatives</w:t>
@@ -5966,7 +6059,7 @@
             <w:r>
               <w:rPr>
                 <w:strike/>
-                <w:color w:val="B00000"/>
+                <w:color w:val="808080"/>
                 <w:rtl w:val="0"/>
               </w:rPr>
             </w:r>
@@ -6005,7 +6098,7 @@
                 <w:b w:val="1"/>
                 <w:bCs w:val="1"/>
                 <w:strike/>
-                <w:color w:val="B00000"/>
+                <w:color w:val="808080"/>
                 <w:rtl w:val="0"/>
               </w:rPr>
               <w:t xml:space="preserve">Precision</w:t>
@@ -6013,7 +6106,7 @@
             <w:r>
               <w:rPr>
                 <w:strike/>
-                <w:color w:val="B00000"/>
+                <w:color w:val="808080"/>
                 <w:rtl w:val="0"/>
               </w:rPr>
             </w:r>
@@ -6052,7 +6145,7 @@
                 <w:b w:val="1"/>
                 <w:bCs w:val="1"/>
                 <w:strike/>
-                <w:color w:val="B00000"/>
+                <w:color w:val="808080"/>
                 <w:rtl w:val="0"/>
               </w:rPr>
               <w:t xml:space="preserve">Recall</w:t>
@@ -6060,7 +6153,7 @@
             <w:r>
               <w:rPr>
                 <w:strike/>
-                <w:color w:val="B00000"/>
+                <w:color w:val="808080"/>
                 <w:rtl w:val="0"/>
               </w:rPr>
             </w:r>
@@ -6103,7 +6196,7 @@
             <w:r>
               <w:rPr>
                 <w:strike/>
-                <w:color w:val="B00000"/>
+                <w:color w:val="808080"/>
                 <w:rtl w:val="0"/>
               </w:rPr>
               <w:t xml:space="preserve">v1 (topic + assertion gate)</w:t>
@@ -6111,7 +6204,7 @@
             <w:r>
               <w:rPr>
                 <w:strike/>
-                <w:color w:val="B00000"/>
+                <w:color w:val="808080"/>
                 <w:rtl w:val="0"/>
               </w:rPr>
             </w:r>
@@ -6147,7 +6240,7 @@
             <w:r>
               <w:rPr>
                 <w:strike/>
-                <w:color w:val="B00000"/>
+                <w:color w:val="808080"/>
                 <w:rtl w:val="0"/>
               </w:rPr>
               <w:t xml:space="preserve">26</w:t>
@@ -6155,7 +6248,7 @@
             <w:r>
               <w:rPr>
                 <w:strike/>
-                <w:color w:val="B00000"/>
+                <w:color w:val="808080"/>
                 <w:rtl w:val="0"/>
               </w:rPr>
             </w:r>
@@ -6191,7 +6284,7 @@
             <w:r>
               <w:rPr>
                 <w:strike/>
-                <w:color w:val="B00000"/>
+                <w:color w:val="808080"/>
                 <w:rtl w:val="0"/>
               </w:rPr>
               <w:t xml:space="preserve">11</w:t>
@@ -6199,7 +6292,7 @@
             <w:r>
               <w:rPr>
                 <w:strike/>
-                <w:color w:val="B00000"/>
+                <w:color w:val="808080"/>
                 <w:rtl w:val="0"/>
               </w:rPr>
             </w:r>
@@ -6235,7 +6328,7 @@
             <w:r>
               <w:rPr>
                 <w:strike/>
-                <w:color w:val="B00000"/>
+                <w:color w:val="808080"/>
                 <w:rtl w:val="0"/>
               </w:rPr>
               <w:t xml:space="preserve">15</w:t>
@@ -6243,7 +6336,7 @@
             <w:r>
               <w:rPr>
                 <w:strike/>
-                <w:color w:val="B00000"/>
+                <w:color w:val="808080"/>
                 <w:rtl w:val="0"/>
               </w:rPr>
             </w:r>
@@ -6279,7 +6372,7 @@
             <w:r>
               <w:rPr>
                 <w:strike/>
-                <w:color w:val="B00000"/>
+                <w:color w:val="808080"/>
                 <w:rtl w:val="0"/>
               </w:rPr>
               <w:t xml:space="preserve">0</w:t>
@@ -6287,7 +6380,7 @@
             <w:r>
               <w:rPr>
                 <w:strike/>
-                <w:color w:val="B00000"/>
+                <w:color w:val="808080"/>
                 <w:rtl w:val="0"/>
               </w:rPr>
             </w:r>
@@ -6324,7 +6417,7 @@
             <w:r>
               <w:rPr>
                 <w:strike/>
-                <w:color w:val="B00000"/>
+                <w:color w:val="808080"/>
                 <w:rtl w:val="0"/>
               </w:rPr>
               <w:t xml:space="preserve">42%</w:t>
@@ -6332,7 +6425,7 @@
             <w:r>
               <w:rPr>
                 <w:strike/>
-                <w:color w:val="B00000"/>
+                <w:color w:val="808080"/>
                 <w:rtl w:val="0"/>
               </w:rPr>
             </w:r>
@@ -6369,7 +6462,7 @@
             <w:r>
               <w:rPr>
                 <w:strike/>
-                <w:color w:val="B00000"/>
+                <w:color w:val="808080"/>
                 <w:rtl w:val="0"/>
               </w:rPr>
               <w:t xml:space="preserve">100%</w:t>
@@ -6377,7 +6470,7 @@
             <w:r>
               <w:rPr>
                 <w:strike/>
-                <w:color w:val="B00000"/>
+                <w:color w:val="808080"/>
                 <w:rtl w:val="0"/>
               </w:rPr>
             </w:r>
@@ -6420,7 +6513,7 @@
             <w:r>
               <w:rPr>
                 <w:strike/>
-                <w:color w:val="B00000"/>
+                <w:color w:val="808080"/>
                 <w:rtl w:val="0"/>
               </w:rPr>
               <w:t xml:space="preserve">v2 (+ non-claim filter taxonomy)</w:t>
@@ -6428,7 +6521,7 @@
             <w:r>
               <w:rPr>
                 <w:strike/>
-                <w:color w:val="B00000"/>
+                <w:color w:val="808080"/>
                 <w:rtl w:val="0"/>
               </w:rPr>
             </w:r>
@@ -6464,7 +6557,7 @@
             <w:r>
               <w:rPr>
                 <w:strike/>
-                <w:color w:val="B00000"/>
+                <w:color w:val="808080"/>
                 <w:rtl w:val="0"/>
               </w:rPr>
               <w:t xml:space="preserve">16</w:t>
@@ -6472,7 +6565,7 @@
             <w:r>
               <w:rPr>
                 <w:strike/>
-                <w:color w:val="B00000"/>
+                <w:color w:val="808080"/>
                 <w:rtl w:val="0"/>
               </w:rPr>
             </w:r>
@@ -6508,7 +6601,7 @@
             <w:r>
               <w:rPr>
                 <w:strike/>
-                <w:color w:val="B00000"/>
+                <w:color w:val="808080"/>
                 <w:rtl w:val="0"/>
               </w:rPr>
               <w:t xml:space="preserve">11</w:t>
@@ -6516,7 +6609,7 @@
             <w:r>
               <w:rPr>
                 <w:strike/>
-                <w:color w:val="B00000"/>
+                <w:color w:val="808080"/>
                 <w:rtl w:val="0"/>
               </w:rPr>
             </w:r>
@@ -6552,7 +6645,7 @@
             <w:r>
               <w:rPr>
                 <w:strike/>
-                <w:color w:val="B00000"/>
+                <w:color w:val="808080"/>
                 <w:rtl w:val="0"/>
               </w:rPr>
               <w:t xml:space="preserve">5</w:t>
@@ -6560,7 +6653,7 @@
             <w:r>
               <w:rPr>
                 <w:strike/>
-                <w:color w:val="B00000"/>
+                <w:color w:val="808080"/>
                 <w:rtl w:val="0"/>
               </w:rPr>
             </w:r>
@@ -6596,7 +6689,7 @@
             <w:r>
               <w:rPr>
                 <w:strike/>
-                <w:color w:val="B00000"/>
+                <w:color w:val="808080"/>
                 <w:rtl w:val="0"/>
               </w:rPr>
               <w:t xml:space="preserve">0</w:t>
@@ -6604,7 +6697,7 @@
             <w:r>
               <w:rPr>
                 <w:strike/>
-                <w:color w:val="B00000"/>
+                <w:color w:val="808080"/>
                 <w:rtl w:val="0"/>
               </w:rPr>
             </w:r>
@@ -6641,7 +6734,7 @@
             <w:r>
               <w:rPr>
                 <w:strike/>
-                <w:color w:val="B00000"/>
+                <w:color w:val="808080"/>
                 <w:rtl w:val="0"/>
               </w:rPr>
               <w:t xml:space="preserve">69%</w:t>
@@ -6649,7 +6742,7 @@
             <w:r>
               <w:rPr>
                 <w:strike/>
-                <w:color w:val="B00000"/>
+                <w:color w:val="808080"/>
                 <w:rtl w:val="0"/>
               </w:rPr>
             </w:r>
@@ -6686,7 +6779,7 @@
             <w:r>
               <w:rPr>
                 <w:strike/>
-                <w:color w:val="B00000"/>
+                <w:color w:val="808080"/>
                 <w:rtl w:val="0"/>
               </w:rPr>
               <w:t xml:space="preserve">100%</w:t>
@@ -6694,7 +6787,7 @@
             <w:r>
               <w:rPr>
                 <w:strike/>
-                <w:color w:val="B00000"/>
+                <w:color w:val="808080"/>
                 <w:rtl w:val="0"/>
               </w:rPr>
             </w:r>
@@ -6737,7 +6830,7 @@
             <w:r>
               <w:rPr>
                 <w:strike/>
-                <w:color w:val="B00000"/>
+                <w:color w:val="808080"/>
                 <w:rtl w:val="0"/>
               </w:rPr>
               <w:t xml:space="preserve">v3 (+ governance and methodology filters)</w:t>
@@ -6745,7 +6838,7 @@
             <w:r>
               <w:rPr>
                 <w:strike/>
-                <w:color w:val="B00000"/>
+                <w:color w:val="808080"/>
                 <w:rtl w:val="0"/>
               </w:rPr>
             </w:r>
@@ -6781,7 +6874,7 @@
             <w:r>
               <w:rPr>
                 <w:strike/>
-                <w:color w:val="B00000"/>
+                <w:color w:val="808080"/>
                 <w:rtl w:val="0"/>
               </w:rPr>
               <w:t xml:space="preserve">12</w:t>
@@ -6789,7 +6882,7 @@
             <w:r>
               <w:rPr>
                 <w:strike/>
-                <w:color w:val="B00000"/>
+                <w:color w:val="808080"/>
                 <w:rtl w:val="0"/>
               </w:rPr>
             </w:r>
@@ -6825,7 +6918,7 @@
             <w:r>
               <w:rPr>
                 <w:strike/>
-                <w:color w:val="B00000"/>
+                <w:color w:val="808080"/>
                 <w:rtl w:val="0"/>
               </w:rPr>
               <w:t xml:space="preserve">11</w:t>
@@ -6833,7 +6926,7 @@
             <w:r>
               <w:rPr>
                 <w:strike/>
-                <w:color w:val="B00000"/>
+                <w:color w:val="808080"/>
                 <w:rtl w:val="0"/>
               </w:rPr>
             </w:r>
@@ -6869,7 +6962,7 @@
             <w:r>
               <w:rPr>
                 <w:strike/>
-                <w:color w:val="B00000"/>
+                <w:color w:val="808080"/>
                 <w:rtl w:val="0"/>
               </w:rPr>
               <w:t xml:space="preserve">1</w:t>
@@ -6877,7 +6970,7 @@
             <w:r>
               <w:rPr>
                 <w:strike/>
-                <w:color w:val="B00000"/>
+                <w:color w:val="808080"/>
                 <w:rtl w:val="0"/>
               </w:rPr>
             </w:r>
@@ -6913,7 +7006,7 @@
             <w:r>
               <w:rPr>
                 <w:strike/>
-                <w:color w:val="B00000"/>
+                <w:color w:val="808080"/>
                 <w:rtl w:val="0"/>
               </w:rPr>
               <w:t xml:space="preserve">0</w:t>
@@ -6921,7 +7014,7 @@
             <w:r>
               <w:rPr>
                 <w:strike/>
-                <w:color w:val="B00000"/>
+                <w:color w:val="808080"/>
                 <w:rtl w:val="0"/>
               </w:rPr>
             </w:r>
@@ -6958,7 +7051,7 @@
             <w:r>
               <w:rPr>
                 <w:strike/>
-                <w:color w:val="B00000"/>
+                <w:color w:val="808080"/>
                 <w:rtl w:val="0"/>
               </w:rPr>
               <w:t xml:space="preserve">92%</w:t>
@@ -6966,7 +7059,7 @@
             <w:r>
               <w:rPr>
                 <w:strike/>
-                <w:color w:val="B00000"/>
+                <w:color w:val="808080"/>
                 <w:rtl w:val="0"/>
               </w:rPr>
             </w:r>
@@ -7003,7 +7096,7 @@
             <w:r>
               <w:rPr>
                 <w:strike/>
-                <w:color w:val="B00000"/>
+                <w:color w:val="808080"/>
                 <w:rtl w:val="0"/>
               </w:rPr>
               <w:t xml:space="preserve">100%</w:t>
@@ -7011,7 +7104,7 @@
             <w:r>
               <w:rPr>
                 <w:strike/>
-                <w:color w:val="B00000"/>
+                <w:color w:val="808080"/>
                 <w:rtl w:val="0"/>
               </w:rPr>
             </w:r>
@@ -7027,7 +7120,7 @@
       <w:r>
         <w:rPr>
           <w:strike/>
-          <w:color w:val="B00000"/>
+          <w:color w:val="808080"/>
           <w:rtl w:val="0"/>
         </w:rPr>
         <w:t xml:space="preserve">To verify that these gains generalize beyond the sample the filters were tuned on, the v3 engine's full output across both reports (582 candidates) was additionally assessed by an automated </w:t>
@@ -7044,7 +7137,7 @@
       <w:r>
         <w:rPr>
           <w:strike/>
-          <w:color w:val="B00000"/>
+          <w:color w:val="808080"/>
           <w:rtl w:val="0"/>
         </w:rPr>
         <w:t xml:space="preserve">large-language-model auditor </w:t>
@@ -7053,14 +7146,14 @@
       <w:r>
         <w:rPr>
           <w:strike/>
-          <w:color w:val="B00000"/>
+          <w:color w:val="808080"/>
         </w:rPr>
         <w:commentReference w:id="3"/>
       </w:r>
       <w:r>
         <w:rPr>
           <w:strike/>
-          <w:color w:val="B00000"/>
+          <w:color w:val="808080"/>
           <w:rtl w:val="0"/>
         </w:rPr>
         <w:t xml:space="preserve">applying the same operational claim definition. This conservative full-corpus check reproduced the same monotonic improvement, with overall precision rising from 35% (v1) to 45% (v3) and from 40% to 48% on environmental claims. The automated auditor judged systematically more strictly than the human annotators, so its absolute figures are read as a lower bound. It also confirmed a report-type effect first noticed in WP1: precision is substantially higher on the narrative impact report (61%) than on the regulatory ESRS statement (38%), whose mandated methodology and governance disclosures are a structural source of false positives for lexical extraction.</w:t>
@@ -7074,7 +7167,7 @@
       <w:r>
         <w:rPr>
           <w:strike/>
-          <w:color w:val="B00000"/>
+          <w:color w:val="808080"/>
           <w:rtl w:val="0"/>
         </w:rPr>
         <w:t xml:space="preserve">Because the v3 filters had been tuned on the development sample, the 92% figure could not be taken as an estimate of general performance, and the benchmark was expanded to a manual review of 100 v3 candidates from the Unilever statement, carried out with the WP1.5 protocol and with page context permitted for ambiguous sentences. This independent review measured a precision of 67%. Re-audited under the guideline as finalised during the review, the same v3 output measured 33% on the automated auditor, and row-level agreement between the human labels and the auditor was 73%, with every disagreement being a candidate the human accepted and the auditor rejected. The review identified four systematic errors in v3: a default channel through which unmeasured non-claims were recorded as vague claims; numbers that were treated as evidence although they were methodological parameters or projected figures; table rows linearised into pseudo-sentences; and claims whose meaning spans several sentences (Activity 4.4 gives the full analysis). Three guideline rulings were codified from the disagreements: advocacy performed by the company is a claim of conduct, scenario descriptions and measurement-method sentences are not claims, and verifiable governance mechanisms such as remuneration linked to sustainability performance are Governance claims. One human error illustrates the value of page context: "Net zero CO2e achieved by approximately 2070" was labelled a claim, but the page shows it inside a table describing the IPCC SSP1-2.6 pathway, the world's trajectory under that scenario rather than Unilever's own target, which is 2039.</w:t>
@@ -7090,8 +7183,7 @@
       <w:r>
         <w:rPr>
           <w:strike/>
-          <w:color w:val="B00000"/>
-          <w:highlight w:val="yellow"/>
+          <w:color w:val="808080"/>
           <w:rtl w:val="0"/>
         </w:rPr>
         <w:t xml:space="preserve">These findings motivated a fourth revision of the engine with two aims: to remove the identified false-positive families without discarding genuine claims, and to make the claims the engine discards visible so that recall could be measured rather than assumed. Six code changes were made, each mapped to an observed error. (i) A broken-sentence guard rejects candidates that start mid-sentence, have unbalanced parentheses, or contain no verb according to a part-of-speech tagger, which removes linearised table rows. (ii) A policy-content filter removes imperative policy principles and supplier requirements ("Reduce water usage...", "the policy sets out four principles suppliers are required to comply with") while keeping any bullet phrased as the company's own commitment. (iii) The ESRS impact, risk and opportunity register is recognised by its markers ("(OO)", "(VC)", "Negative Impact (") and climate-scenario narratives are removed with it. (iv) The methodology filter was extended to measurement descriptions and to internal self-reference ("these targets are in line with our Environmental Policy"), applied only when the alignment is the point of the sentence. (v) A softer activity filter removes tool usage and programme descriptions with no stated outcome, applied only when the sentence has neither a quantity nor a forward-looking target. (vi) A quantity in a parameter context no longer makes a claim Strong or counts as evidence, and the nouns target, goal, pledge and plan count as forward-looking only when the sentence contains no achievement verb, so that "we delivered on our target to collect and process more plastic than we sell" is an achieved result rather than a promise. In addition, the engine now writes every rejected sentence to a companion file together with the filter that rejected it. (vii) Section headers that PDF extraction glues onto the first sentence of a section ("METRICS AND TARGETS Targets We do not have formal targets on water withdrawal…") are stripped rather than filtered, since the sentence behind the header is usually a genuine claim; only a sentence that consists of nothing but header is rejected.</w:t>
@@ -7105,7 +7197,7 @@
       <w:r>
         <w:rPr>
           <w:strike/>
-          <w:color w:val="B00000"/>
+          <w:color w:val="808080"/>
           <w:rtl w:val="0"/>
         </w:rPr>
         <w:t xml:space="preserve">The precision changes removed 65 candidates from the Unilever output, all of them judged non-claims by the auditor and none an audited claim, so automated precision rose from 33% to 39% and the precision on the human-labelled candidates retained by each version rose from 63% to 72%. Recall was then measured for the first time through the rejected-sentence file. That file contains 1,767 unique sentences for the Unilever statement; a random sample of 100 was prepared for a blind human review under the WP1.5 protocol, with the rejection reasons held separately, and in parallel the</w:t>
@@ -7122,7 +7214,7 @@
       <w:r>
         <w:rPr>
           <w:strike/>
-          <w:color w:val="B00000"/>
+          <w:color w:val="808080"/>
           <w:rtl w:val="0"/>
         </w:rPr>
         <w:t xml:space="preserve"> full rejected set was audited automatically</w:t>
@@ -7131,14 +7223,14 @@
       <w:r>
         <w:rPr>
           <w:strike/>
-          <w:color w:val="B00000"/>
+          <w:color w:val="808080"/>
         </w:rPr>
         <w:commentReference w:id="4"/>
       </w:r>
       <w:r>
         <w:rPr>
           <w:strike/>
-          <w:color w:val="B00000"/>
+          <w:color w:val="808080"/>
           <w:rtl w:val="0"/>
         </w:rPr>
         <w:t xml:space="preserve"> with the same operational definition and the page-context rule, every flagged sentence being re-examined by two adversarial reviewers instructed to refute the flag. Of 194 flagged sentences, 149 survived both reviewers, 23 were contested and 22 refuted, and the 100-sentence random sample contained 6 confirmed misses, consistent with the full scan. Against the 137 audited claims the engine retained, recall was therefore 48%. Three quarters of the misses (113 of 149) were rejected at the detection gate itself: the sentence contained a genuine claim but none of the engine's action verbs, topic words or quantity units ("In 2025, we purchased more than 152 kilotonnes of recycled plastic"; "our Shakti programme supports over 200,000 women micro-entrepreneurs", which contains no environmental topic word because the gate vocabulary had grown from an environmental extractor). A further 14 misses were target and metric tables longer than the sentence-length limit, 8 were removed by the reference-density rule because years and scope numbers were counted as references, and 6 by page citations treated as navigation; 56 of the 149 misses were measurable Strong claims.</w:t>
@@ -7152,7 +7244,7 @@
       <w:r>
         <w:rPr>
           <w:strike/>
-          <w:color w:val="B00000"/>
+          <w:color w:val="808080"/>
           <w:rtl w:val="0"/>
         </w:rPr>
         <w:t xml:space="preserve">A recall revision followed: achievement and conduct verbs, social and governance topic terms and count units (kilotonnes, hectares, "14 countries") were added to the gate, years and single digits were excluded from the reference-density count, a page citation now counts as navigation only when the sentence asserts nothing, and the company's own site standards were removed from the policy filter. The first version of these changes recovered 75 of the 149 misses without losing any audited claim but admitted 273 new candidates of which only 66 were claims; scoring each added keyword by the claims and false positives it bought showed that bare verb stems were responsible ("purchase" matched the scope 3 category "purchased goods and services", "process" matched the noun), so the noisy stems were kept only in first-person or past-tense form. Finally, the claim and non-claim files of the final engine were both submitted to the automated auditor, so that every one of its 585 retained candidates carries a verdict (257 claims, 324 non-claims, 4 contested) and every rejected sentence has been screened for missed claims. Table 3 summarises the progression. The final engine is better than v3 on both measures at once: 44% precision and 73% recall, against 33% and an unmeasured recall for v3. Because the filters and vocabularies were designed from the categorised errors of the same audited rows, these figures are in-sample results; a fresh manual review of the final output under the same protocol is the next benchmark.</w:t>
@@ -7175,7 +7267,7 @@
       <w:r>
         <w:rPr>
           <w:strike/>
-          <w:color w:val="B00000"/>
+          <w:color w:val="808080"/>
           <w:rtl w:val="0"/>
         </w:rPr>
         <w:t xml:space="preserve">Table 3. Precision and recall of the v3 and v4 engines on the Unilever sustainability statement.</w:t>
@@ -7184,14 +7276,14 @@
       <w:r>
         <w:rPr>
           <w:strike/>
-          <w:color w:val="B00000"/>
+          <w:color w:val="808080"/>
         </w:rPr>
         <w:commentReference w:id="5"/>
       </w:r>
       <w:r>
         <w:rPr>
           <w:strike/>
-          <w:color w:val="B00000"/>
+          <w:color w:val="808080"/>
           <w:rtl w:val="0"/>
         </w:rPr>
       </w:r>
@@ -8033,21 +8125,7 @@
           <w:rFonts w:ascii="Times New Roman" w:hAnsi="Times New Roman"/>
           <w:highlight w:val="green"/>
         </w:rPr>
-        <w:t xml:space="preserve">Precision on the part of the output shared with v3 is 72% (23 of 32), measured on final labels; the remainder of the estimate depends on the two samples still to be labelled. </w:t>
-      </w:r>
-      <w:r>
-        <w:rPr>
-          <w:rFonts w:ascii="Times New Roman" w:hAnsi="Times New Roman"/>
-          <w:highlight w:val="green"/>
-        </w:rPr>
-        <w:t xml:space="preserve">The figures are estimates with sampling error, and the rejected stratum carries the most of it: at a low rate of missed claims, a sample of 100 rejected sentences contains only a handful of positives, so the recall estimate is the least precise number in the table and should be read as an indication rather than a point value. </w:t>
-      </w:r>
-      <w:r>
-        <w:rPr>
-          <w:rFonts w:ascii="Times New Roman" w:hAnsi="Times New Roman"/>
-          <w:highlight w:val="green"/>
-        </w:rPr>
-        <w:t>The 67% precision reported for v3 in WP3 is not directly comparable with the precision above: it was measured on a different version, on a sample drawn from that version's output, and before the guideline rulings were finalised.</w:t>
+        <w:t>Precision on the part of the output shared with v3 is 72% (23 of 32), measured on final labels; the remainder of the estimate depends on the two samples still to be labelled. The figures are estimates with sampling error, and the rejected stratum carries the most of it: at a low rate of missed claims, a sample of 100 rejected sentences contains only a handful of positives, so the recall estimate is the least precise number in the table and should be read as an indication rather than a point value. The 67% precision reported for v3 in WP3 is not directly comparable with the precision above: it was measured on a different version, on a sample drawn from that version's output, and before the guideline rulings were finalised.</w:t>
       </w:r>
     </w:p>
     <w:tbl>
@@ -8119,7 +8197,7 @@
                 <w:b w:val="1"/>
                 <w:bCs w:val="1"/>
                 <w:strike/>
-                <w:color w:val="B00000"/>
+                <w:color w:val="808080"/>
                 <w:rtl w:val="0"/>
               </w:rPr>
               <w:t xml:space="preserve">Measure</w:t>
@@ -8127,7 +8205,7 @@
             <w:r>
               <w:rPr>
                 <w:strike/>
-                <w:color w:val="B00000"/>
+                <w:color w:val="808080"/>
                 <w:rtl w:val="0"/>
               </w:rPr>
             </w:r>
@@ -8166,7 +8244,7 @@
                 <w:b w:val="1"/>
                 <w:bCs w:val="1"/>
                 <w:strike/>
-                <w:color w:val="B00000"/>
+                <w:color w:val="808080"/>
                 <w:rtl w:val="0"/>
               </w:rPr>
               <w:t xml:space="preserve">v3</w:t>
@@ -8174,7 +8252,7 @@
             <w:r>
               <w:rPr>
                 <w:strike/>
-                <w:color w:val="B00000"/>
+                <w:color w:val="808080"/>
                 <w:rtl w:val="0"/>
               </w:rPr>
             </w:r>
@@ -8213,7 +8291,7 @@
                 <w:b w:val="1"/>
                 <w:bCs w:val="1"/>
                 <w:strike/>
-                <w:color w:val="B00000"/>
+                <w:color w:val="808080"/>
                 <w:rtl w:val="0"/>
               </w:rPr>
               <w:t xml:space="preserve">v4 (precision revision)</w:t>
@@ -8221,7 +8299,7 @@
             <w:r>
               <w:rPr>
                 <w:strike/>
-                <w:color w:val="B00000"/>
+                <w:color w:val="808080"/>
                 <w:rtl w:val="0"/>
               </w:rPr>
             </w:r>
@@ -8260,7 +8338,7 @@
                 <w:b w:val="1"/>
                 <w:bCs w:val="1"/>
                 <w:strike/>
-                <w:color w:val="B00000"/>
+                <w:color w:val="808080"/>
                 <w:rtl w:val="0"/>
               </w:rPr>
               <w:t xml:space="preserve">v4 final (recall revision)</w:t>
@@ -8268,7 +8346,7 @@
             <w:r>
               <w:rPr>
                 <w:strike/>
-                <w:color w:val="B00000"/>
+                <w:color w:val="808080"/>
                 <w:rtl w:val="0"/>
               </w:rPr>
             </w:r>
@@ -8311,7 +8389,7 @@
             <w:r>
               <w:rPr>
                 <w:strike/>
-                <w:color w:val="B00000"/>
+                <w:color w:val="808080"/>
                 <w:rtl w:val="0"/>
               </w:rPr>
               <w:t xml:space="preserve">Candidates extracted</w:t>
@@ -8319,7 +8397,7 @@
             <w:r>
               <w:rPr>
                 <w:strike/>
-                <w:color w:val="B00000"/>
+                <w:color w:val="808080"/>
                 <w:rtl w:val="0"/>
               </w:rPr>
             </w:r>
@@ -8355,7 +8433,7 @@
             <w:r>
               <w:rPr>
                 <w:strike/>
-                <w:color w:val="B00000"/>
+                <w:color w:val="808080"/>
                 <w:rtl w:val="0"/>
               </w:rPr>
               <w:t xml:space="preserve">416</w:t>
@@ -8363,7 +8441,7 @@
             <w:r>
               <w:rPr>
                 <w:strike/>
-                <w:color w:val="B00000"/>
+                <w:color w:val="808080"/>
                 <w:rtl w:val="0"/>
               </w:rPr>
             </w:r>
@@ -8399,7 +8477,7 @@
             <w:r>
               <w:rPr>
                 <w:strike/>
-                <w:color w:val="B00000"/>
+                <w:color w:val="808080"/>
                 <w:rtl w:val="0"/>
               </w:rPr>
               <w:t xml:space="preserve">351</w:t>
@@ -8407,7 +8485,7 @@
             <w:r>
               <w:rPr>
                 <w:strike/>
-                <w:color w:val="B00000"/>
+                <w:color w:val="808080"/>
                 <w:rtl w:val="0"/>
               </w:rPr>
             </w:r>
@@ -8443,7 +8521,7 @@
             <w:r>
               <w:rPr>
                 <w:strike/>
-                <w:color w:val="B00000"/>
+                <w:color w:val="808080"/>
                 <w:rtl w:val="0"/>
               </w:rPr>
               <w:t xml:space="preserve">585</w:t>
@@ -8451,7 +8529,7 @@
             <w:r>
               <w:rPr>
                 <w:strike/>
-                <w:color w:val="B00000"/>
+                <w:color w:val="808080"/>
                 <w:rtl w:val="0"/>
               </w:rPr>
             </w:r>
@@ -8494,7 +8572,7 @@
             <w:r>
               <w:rPr>
                 <w:strike/>
-                <w:color w:val="B00000"/>
+                <w:color w:val="808080"/>
                 <w:rtl w:val="0"/>
               </w:rPr>
               <w:t xml:space="preserve">Precision, human-labelled candidates retained</w:t>
@@ -8502,7 +8580,7 @@
             <w:r>
               <w:rPr>
                 <w:strike/>
-                <w:color w:val="B00000"/>
+                <w:color w:val="808080"/>
                 <w:rtl w:val="0"/>
               </w:rPr>
             </w:r>
@@ -8538,7 +8616,7 @@
             <w:r>
               <w:rPr>
                 <w:strike/>
-                <w:color w:val="B00000"/>
+                <w:color w:val="808080"/>
                 <w:rtl w:val="0"/>
               </w:rPr>
               <w:t xml:space="preserve">63%</w:t>
@@ -8546,7 +8624,7 @@
             <w:r>
               <w:rPr>
                 <w:strike/>
-                <w:color w:val="B00000"/>
+                <w:color w:val="808080"/>
                 <w:rtl w:val="0"/>
               </w:rPr>
             </w:r>
@@ -8582,7 +8660,7 @@
             <w:r>
               <w:rPr>
                 <w:strike/>
-                <w:color w:val="B00000"/>
+                <w:color w:val="808080"/>
                 <w:rtl w:val="0"/>
               </w:rPr>
               <w:t xml:space="preserve">72%</w:t>
@@ -8590,7 +8668,7 @@
             <w:r>
               <w:rPr>
                 <w:strike/>
-                <w:color w:val="B00000"/>
+                <w:color w:val="808080"/>
                 <w:rtl w:val="0"/>
               </w:rPr>
             </w:r>
@@ -8626,7 +8704,7 @@
             <w:r>
               <w:rPr>
                 <w:strike/>
-                <w:color w:val="B00000"/>
+                <w:color w:val="808080"/>
                 <w:rtl w:val="0"/>
               </w:rPr>
               <w:t xml:space="preserve">72%</w:t>
@@ -8634,7 +8712,7 @@
             <w:r>
               <w:rPr>
                 <w:strike/>
-                <w:color w:val="B00000"/>
+                <w:color w:val="808080"/>
                 <w:rtl w:val="0"/>
               </w:rPr>
             </w:r>
@@ -8677,7 +8755,7 @@
             <w:r>
               <w:rPr>
                 <w:strike/>
-                <w:color w:val="B00000"/>
+                <w:color w:val="808080"/>
                 <w:rtl w:val="0"/>
               </w:rPr>
               <w:t xml:space="preserve">Precision, automated audit of all candidates</w:t>
@@ -8685,7 +8763,7 @@
             <w:r>
               <w:rPr>
                 <w:strike/>
-                <w:color w:val="B00000"/>
+                <w:color w:val="808080"/>
                 <w:rtl w:val="0"/>
               </w:rPr>
             </w:r>
@@ -8721,7 +8799,7 @@
             <w:r>
               <w:rPr>
                 <w:strike/>
-                <w:color w:val="B00000"/>
+                <w:color w:val="808080"/>
                 <w:rtl w:val="0"/>
               </w:rPr>
               <w:t xml:space="preserve">33%</w:t>
@@ -8729,7 +8807,7 @@
             <w:r>
               <w:rPr>
                 <w:strike/>
-                <w:color w:val="B00000"/>
+                <w:color w:val="808080"/>
                 <w:rtl w:val="0"/>
               </w:rPr>
             </w:r>
@@ -8765,7 +8843,7 @@
             <w:r>
               <w:rPr>
                 <w:strike/>
-                <w:color w:val="B00000"/>
+                <w:color w:val="808080"/>
                 <w:rtl w:val="0"/>
               </w:rPr>
               <w:t xml:space="preserve">39%</w:t>
@@ -8773,7 +8851,7 @@
             <w:r>
               <w:rPr>
                 <w:strike/>
-                <w:color w:val="B00000"/>
+                <w:color w:val="808080"/>
                 <w:rtl w:val="0"/>
               </w:rPr>
             </w:r>
@@ -8809,7 +8887,7 @@
             <w:r>
               <w:rPr>
                 <w:strike/>
-                <w:color w:val="B00000"/>
+                <w:color w:val="808080"/>
                 <w:rtl w:val="0"/>
               </w:rPr>
               <w:t xml:space="preserve">44%</w:t>
@@ -8817,7 +8895,7 @@
             <w:r>
               <w:rPr>
                 <w:strike/>
-                <w:color w:val="B00000"/>
+                <w:color w:val="808080"/>
                 <w:rtl w:val="0"/>
               </w:rPr>
             </w:r>
@@ -8860,7 +8938,7 @@
             <w:r>
               <w:rPr>
                 <w:strike/>
-                <w:color w:val="B00000"/>
+                <w:color w:val="808080"/>
                 <w:rtl w:val="0"/>
               </w:rPr>
               <w:t xml:space="preserve">Recall, against all audited genuine claims</w:t>
@@ -8868,7 +8946,7 @@
             <w:r>
               <w:rPr>
                 <w:strike/>
-                <w:color w:val="B00000"/>
+                <w:color w:val="808080"/>
                 <w:rtl w:val="0"/>
               </w:rPr>
             </w:r>
@@ -8904,7 +8982,7 @@
             <w:r>
               <w:rPr>
                 <w:strike/>
-                <w:color w:val="B00000"/>
+                <w:color w:val="808080"/>
                 <w:rtl w:val="0"/>
               </w:rPr>
               <w:t xml:space="preserve">not measurable</w:t>
@@ -8912,7 +8990,7 @@
             <w:r>
               <w:rPr>
                 <w:strike/>
-                <w:color w:val="B00000"/>
+                <w:color w:val="808080"/>
                 <w:rtl w:val="0"/>
               </w:rPr>
             </w:r>
@@ -8948,7 +9026,7 @@
             <w:r>
               <w:rPr>
                 <w:strike/>
-                <w:color w:val="B00000"/>
+                <w:color w:val="808080"/>
                 <w:rtl w:val="0"/>
               </w:rPr>
               <w:t xml:space="preserve">48%</w:t>
@@ -8956,7 +9034,7 @@
             <w:r>
               <w:rPr>
                 <w:strike/>
-                <w:color w:val="B00000"/>
+                <w:color w:val="808080"/>
                 <w:rtl w:val="0"/>
               </w:rPr>
             </w:r>
@@ -8992,7 +9070,7 @@
             <w:r>
               <w:rPr>
                 <w:strike/>
-                <w:color w:val="B00000"/>
+                <w:color w:val="808080"/>
                 <w:rtl w:val="0"/>
               </w:rPr>
               <w:t xml:space="preserve">73%</w:t>
@@ -9000,7 +9078,7 @@
             <w:r>
               <w:rPr>
                 <w:strike/>
-                <w:color w:val="B00000"/>
+                <w:color w:val="808080"/>
                 <w:rtl w:val="0"/>
               </w:rPr>
             </w:r>
@@ -9043,7 +9121,7 @@
             <w:r>
               <w:rPr>
                 <w:strike/>
-                <w:color w:val="B00000"/>
+                <w:color w:val="808080"/>
                 <w:rtl w:val="0"/>
               </w:rPr>
               <w:t xml:space="preserve">Candidate split E / S / G</w:t>
@@ -9051,7 +9129,7 @@
             <w:r>
               <w:rPr>
                 <w:strike/>
-                <w:color w:val="B00000"/>
+                <w:color w:val="808080"/>
                 <w:rtl w:val="0"/>
               </w:rPr>
             </w:r>
@@ -9087,7 +9165,7 @@
             <w:r>
               <w:rPr>
                 <w:strike/>
-                <w:color w:val="B00000"/>
+                <w:color w:val="808080"/>
                 <w:rtl w:val="0"/>
               </w:rPr>
               <w:t xml:space="preserve">380 / 26 / 10</w:t>
@@ -9095,7 +9173,7 @@
             <w:r>
               <w:rPr>
                 <w:strike/>
-                <w:color w:val="B00000"/>
+                <w:color w:val="808080"/>
                 <w:rtl w:val="0"/>
               </w:rPr>
             </w:r>
@@ -9131,7 +9209,7 @@
             <w:r>
               <w:rPr>
                 <w:strike/>
-                <w:color w:val="B00000"/>
+                <w:color w:val="808080"/>
                 <w:rtl w:val="0"/>
               </w:rPr>
               <w:t xml:space="preserve">318 / 22 / 11</w:t>
@@ -9139,7 +9217,7 @@
             <w:r>
               <w:rPr>
                 <w:strike/>
-                <w:color w:val="B00000"/>
+                <w:color w:val="808080"/>
                 <w:rtl w:val="0"/>
               </w:rPr>
             </w:r>
@@ -9175,7 +9253,7 @@
             <w:r>
               <w:rPr>
                 <w:strike/>
-                <w:color w:val="B00000"/>
+                <w:color w:val="808080"/>
                 <w:rtl w:val="0"/>
               </w:rPr>
               <w:t xml:space="preserve">308 / 182 / 95</w:t>
@@ -9183,7 +9261,7 @@
             <w:r>
               <w:rPr>
                 <w:strike/>
-                <w:color w:val="B00000"/>
+                <w:color w:val="808080"/>
                 <w:rtl w:val="0"/>
               </w:rPr>
             </w:r>
@@ -9199,7 +9277,7 @@
       <w:r>
         <w:rPr>
           <w:strike/>
-          <w:color w:val="B00000"/>
+          <w:color w:val="808080"/>
           <w:rtl w:val="0"/>
         </w:rPr>
         <w:t xml:space="preserve">Activity 4.3 – ESG Type Classification Evaluation</w:t>
@@ -9207,7 +9285,7 @@
       <w:r>
         <w:rPr>
           <w:strike/>
-          <w:color w:val="B00000"/>
+          <w:color w:val="808080"/>
           <w:rtl w:val="0"/>
         </w:rPr>
       </w:r>
@@ -9219,8 +9297,7 @@
       <w:r>
         <w:rPr>
           <w:strike/>
-          <w:color w:val="B00000"/>
-          <w:highlight w:val="yellow"/>
+          <w:color w:val="808080"/>
           <w:rtl w:val="0"/>
         </w:rPr>
         <w:t xml:space="preserve">A confusion-matrix evaluation of the E/S/G type assignment (true type versus predicted type) will be computed on the expanded 100-claim benchmark, where each candidate’s true ESG type is part of the human annotation.</w:t>
@@ -9228,7 +9305,7 @@
       <w:r>
         <w:rPr>
           <w:strike/>
-          <w:color w:val="B00000"/>
+          <w:color w:val="808080"/>
           <w:rtl w:val="0"/>
         </w:rPr>
       </w:r>
@@ -9251,7 +9328,7 @@
           <w:rFonts w:ascii="Times New Roman" w:hAnsi="Times New Roman"/>
           <w:highlight w:val="green"/>
         </w:rPr>
-        <w:t xml:space="preserve">For the extracted sentences labelled as claims, the human ESG type is compared with the engine's label in a three-by-three confusion matrix (Table 4). </w:t>
+        <w:t xml:space="preserve">For the extracted sentences labelled as claims, the human ESG type is compared with the engine's label in a three-by-three confusion matrix (Table 5). </w:t>
       </w:r>
       <w:r>
         <w:rPr>
@@ -9267,7 +9344,7 @@
           <w:rFonts w:ascii="Times New Roman" w:hAnsi="Times New Roman"/>
           <w:highlight w:val="green"/>
         </w:rPr>
-        <w:t>Table 4. ESG type confusion matrix, human type (rows) against engine type (columns), on the genuine claims of the extracted stratum (provisional, n = 13).</w:t>
+        <w:t>Table 5. ESG type confusion matrix, human type (rows) against engine type (columns), on the genuine claims of the extracted stratum (provisional, n = 13).</w:t>
       </w:r>
     </w:p>
     <w:tbl>
@@ -9389,7 +9466,7 @@
               <w:rPr>
                 <w:rFonts w:ascii="Times New Roman" w:hAnsi="Times New Roman"/>
                 <w:sz w:val="18"/>
-                <w:highlight w:val="red"/>
+                <w:highlight w:val="yellow"/>
               </w:rPr>
               <w:t>9</w:t>
             </w:r>
@@ -9405,7 +9482,7 @@
               <w:rPr>
                 <w:rFonts w:ascii="Times New Roman" w:hAnsi="Times New Roman"/>
                 <w:sz w:val="18"/>
-                <w:highlight w:val="red"/>
+                <w:highlight w:val="yellow"/>
               </w:rPr>
               <w:t>2</w:t>
             </w:r>
@@ -9421,7 +9498,7 @@
               <w:rPr>
                 <w:rFonts w:ascii="Times New Roman" w:hAnsi="Times New Roman"/>
                 <w:sz w:val="18"/>
-                <w:highlight w:val="red"/>
+                <w:highlight w:val="yellow"/>
               </w:rPr>
               <w:t>0</w:t>
             </w:r>
@@ -9456,7 +9533,7 @@
               <w:rPr>
                 <w:rFonts w:ascii="Times New Roman" w:hAnsi="Times New Roman"/>
                 <w:sz w:val="18"/>
-                <w:highlight w:val="red"/>
+                <w:highlight w:val="yellow"/>
               </w:rPr>
               <w:t>1</w:t>
             </w:r>
@@ -9472,7 +9549,7 @@
               <w:rPr>
                 <w:rFonts w:ascii="Times New Roman" w:hAnsi="Times New Roman"/>
                 <w:sz w:val="18"/>
-                <w:highlight w:val="red"/>
+                <w:highlight w:val="yellow"/>
               </w:rPr>
               <w:t>0</w:t>
             </w:r>
@@ -9488,7 +9565,7 @@
               <w:rPr>
                 <w:rFonts w:ascii="Times New Roman" w:hAnsi="Times New Roman"/>
                 <w:sz w:val="18"/>
-                <w:highlight w:val="red"/>
+                <w:highlight w:val="yellow"/>
               </w:rPr>
               <w:t>0</w:t>
             </w:r>
@@ -9523,7 +9600,7 @@
               <w:rPr>
                 <w:rFonts w:ascii="Times New Roman" w:hAnsi="Times New Roman"/>
                 <w:sz w:val="18"/>
-                <w:highlight w:val="red"/>
+                <w:highlight w:val="yellow"/>
               </w:rPr>
               <w:t>0</w:t>
             </w:r>
@@ -9539,7 +9616,7 @@
               <w:rPr>
                 <w:rFonts w:ascii="Times New Roman" w:hAnsi="Times New Roman"/>
                 <w:sz w:val="18"/>
-                <w:highlight w:val="red"/>
+                <w:highlight w:val="yellow"/>
               </w:rPr>
               <w:t>0</w:t>
             </w:r>
@@ -9555,7 +9632,7 @@
               <w:rPr>
                 <w:rFonts w:ascii="Times New Roman" w:hAnsi="Times New Roman"/>
                 <w:sz w:val="18"/>
-                <w:highlight w:val="red"/>
+                <w:highlight w:val="yellow"/>
               </w:rPr>
               <w:t>1</w:t>
             </w:r>
@@ -9582,7 +9659,7 @@
       <w:r>
         <w:rPr>
           <w:strike/>
-          <w:color w:val="B00000"/>
+          <w:color w:val="808080"/>
           <w:rtl w:val="0"/>
         </w:rPr>
         <w:t xml:space="preserve">Activity 4.4 – Error Analysis</w:t>
@@ -9596,7 +9673,7 @@
       <w:r>
         <w:rPr>
           <w:strike/>
-          <w:color w:val="B00000"/>
+          <w:color w:val="808080"/>
           <w:rtl w:val="0"/>
         </w:rPr>
         <w:t xml:space="preserve">The full-corpus audit also categorized every remaining false positive of the final engine version, yielding the following distribution: reporting methodology and definitions, approximately 42%; general advocacy and opinion statements, approximately 21%; activity and membership reports, approximately 14%; risk and dependency descriptions, approximately 10%; residual governance role descriptions, approximately 9%; navigation fragments and other, approximately 4%. Methodology sentences remain the dominant error source even after filtering: they are the hardest class to remove lexically, because the same verbs and vocabulary appear both in genuine performance statements and in descriptions of how figures are computed.</w:t>
@@ -9610,7 +9687,7 @@
       <w:r>
         <w:rPr>
           <w:strike/>
-          <w:color w:val="B00000"/>
+          <w:color w:val="808080"/>
           <w:rtl w:val="0"/>
         </w:rPr>
         <w:t xml:space="preserve">This first distribution was measured across both evaluation reports under the original annotation guideline, whose error taxonomy had six categories. The 100-candidate review refined that guideline, and the refined taxonomy separates policy bullets, anaphoric fragments and table fragments into categories of their own. When the v3 output for the Unilever statement was re-audited under the finalised guideline, its 279 false positives were distributed as follows: reporting methodology and definitions 28%; activity and tool-usage reports 22%; risk and scenario descriptions 15%; policy-principle bullets 10%; general advocacy and opinion 9%; anaphoric fragments 5%; table fragments 4%; governance role descriptions 4%; other 3%. The fall in the methodology share from 42% to 28% reflects the new categories rather than a change in the engine. Methodology remains the largest single source of error under both taxonomies, for the same reason as before.</w:t>
@@ -9624,7 +9701,7 @@
       <w:r>
         <w:rPr>
           <w:strike/>
-          <w:color w:val="B00000"/>
+          <w:color w:val="808080"/>
           <w:rtl w:val="0"/>
         </w:rPr>
         <w:t xml:space="preserve">The refined audit also exposed two structural patterns that the category counts do not show. The combination of an Environmental type, a Vague claim type and no evidence acted as a default channel for false positives: any sentence that passed the topic and assertion gate without a quantity or a future marker received exactly this label, so methodology descriptions, definitions and general statements were recorded as vague claims. The cell held 136 of the 416 v3 candidates and 76% of it was non-claims, yet it also contained the unmeasured commitments that greenwashing detection most needs to keep, such as "we are committed to a sustainable future". The cell where the greenwashing signal is strongest is therefore also the cell where lexical extraction is least reliable, and it cannot be discarded, only separated. Secondly, a number inside a sentence is not the same thing as evidence for a claim: in candidates labelled Strong a quantity was always present, but it was often a methodological parameter (a site-selection radius of 1 km, a measurement-method share of 78%), a figure attached to an unrelated topic, or the projected size of a promise, and 43% of the Strong class was non-claims. The v4 revision reduced the false-positive share of the default channel to 63% and of the Strong class to 37%. Type assignment was comparatively reliable throughout: on the audited genuine claims the engine's E/S/G label agreed with the auditor in 90% of cases, and the human annotator's own disagreements were concentrated in social claims (human rights, Indigenous peoples' rights) labelled Environmental by association with the word sustainability.</w:t>
@@ -9655,7 +9732,7 @@
           <w:rFonts w:ascii="Times New Roman" w:hAnsi="Times New Roman"/>
           <w:highlight w:val="red"/>
         </w:rPr>
-        <w:t xml:space="preserve">This categorisation will be completed from the 28 false positives and 5 false negatives once the labels are final. </w:t>
+        <w:t xml:space="preserve">This categorisation will be completed once the labels are final. </w:t>
       </w:r>
       <w:r>
         <w:rPr>
@@ -9670,6 +9747,7 @@
         <w:rPr/>
       </w:pPr>
       <w:r>
+        <w:rPr/>
         <w:pict>
           <v:rect style="width:0.0pt;height:1.5pt" o:hr="t" o:hrstd="t" o:hralign="center" fillcolor="#A0A0A0" stroked="f"/>
         </w:pict>
@@ -9688,7 +9766,7 @@
       <w:r>
         <w:rPr>
           <w:strike/>
-          <w:color w:val="B00000"/>
+          <w:color w:val="808080"/>
           <w:rtl w:val="0"/>
         </w:rPr>
         <w:t xml:space="preserve">Activity 4.5 – </w:t>
@@ -9705,7 +9783,7 @@
       <w:r>
         <w:rPr>
           <w:strike/>
-          <w:color w:val="B00000"/>
+          <w:color w:val="808080"/>
           <w:rtl w:val="0"/>
         </w:rPr>
         <w:t xml:space="preserve">Rule Improvement Assessment</w:t>
@@ -9714,14 +9792,14 @@
       <w:r>
         <w:rPr>
           <w:strike/>
-          <w:color w:val="B00000"/>
+          <w:color w:val="808080"/>
         </w:rPr>
         <w:commentReference w:id="7"/>
       </w:r>
       <w:r>
         <w:rPr>
           <w:strike/>
-          <w:color w:val="B00000"/>
+          <w:color w:val="808080"/>
           <w:rtl w:val="0"/>
         </w:rPr>
       </w:r>
@@ -9760,7 +9838,7 @@
       <w:r>
         <w:rPr>
           <w:strike/>
-          <w:color w:val="B00000"/>
+          <w:color w:val="808080"/>
           <w:rtl w:val="0"/>
         </w:rPr>
         <w:t xml:space="preserve">Activity 4.6 – Baseline Limit Analysis</w:t>
@@ -9768,7 +9846,7 @@
       <w:r>
         <w:rPr>
           <w:strike/>
-          <w:color w:val="B00000"/>
+          <w:color w:val="808080"/>
           <w:rtl w:val="0"/>
         </w:rPr>
       </w:r>
@@ -9793,13 +9871,13 @@
       </w:pPr>
       <w:r>
         <w:rPr>
-          <w:highlight w:val="green"/>
           <w:rtl w:val="0"/>
         </w:rPr>
         <w:t xml:space="preserve">The remaining errors are concentrated precisely where claim status depends on meaning rather than surface form, and they define the boundary of what lexical rules can achieve. Four semantic failure modes recur. First, assertion versus description: the same verb can report an operation or claim an achievement ("we source ingredients from sectors vulnerable to climate change" versus "we sourced 95% deforestation-free"), and "set targets" describes a process while containing the future marker "target". Second, achieved versus projected quantities: "an additional 55 million gallons per year by 2030" is the size of a promise, not evidence of a result, yet lexically it is indistinguishable from a performance figure. Third, lexical ambiguity beyond the hand-coded cases ("nature of our business", "working environment"). Fourth, mixed sentences that interleave genuine claims with process language ("we continue to deliver underlying reductions…"), which cannot be phrase-filtered without sacrificing recall. These systematic residuals, rather than any shortage of filter engineering, constitute the scientific motivation for the transformer-based claim analysis of WP5: the discrimination still missing is semantic, which is exactly what contextual language models provide.</w:t>
       </w:r>
       <w:commentRangeEnd w:id="6"/>
       <w:r>
+        <w:rPr/>
         <w:commentReference w:id="6"/>
       </w:r>
       <w:r>
@@ -9835,7 +9913,7 @@
           <w:rFonts w:ascii="Times New Roman" w:hAnsi="Times New Roman"/>
           <w:highlight w:val="green"/>
         </w:rPr>
-        <w:t>The automated large-language-model audits (the full-corpus assessment of the v3 and v4 outputs, the automated recall estimate from the rejected-sentence file, the keyword-yield analysis used to prune the widened gate, and the comparison of automated with human labels) have been removed from WP3 and WP4. They will be reported in WP5 as an LLM-assisted audit compared against the human benchmark of Activity 4.1. The former Table 3 (v3 versus v4 audit figures) and the audit-based error distributions are retained for that section.</w:t>
+        <w:t>The automated large-language-model audits (the full-corpus assessment of the v3 and v4 outputs, the automated recall estimate from the rejected-sentence file, the keyword-yield analysis used to prune the widened gate, and the comparison of automated with human labels) have been removed from WP3 and WP4. They will be reported in WP5 as an LLM-assisted audit compared against the human benchmark of Activity 4.1, together with the audit-based error distributions and the v3 versus v4 audit table.</w:t>
       </w:r>
     </w:p>
     <w:p>

</xml_diff>

<commit_message>
Review copy: state the single-report scope of the benchmark and name the development sample's composition
Co-Authored-By: Claude Opus 5 <noreply@anthropic.com>
</commit_message>
<xml_diff>
--- a/paper/GreenBERT_Project_Report_v3_REVIEW.docx
+++ b/paper/GreenBERT_Project_Report_v3_REVIEW.docx
@@ -3985,7 +3985,7 @@
           <w:rFonts w:ascii="Times New Roman" w:hAnsi="Times New Roman"/>
           <w:highlight w:val="green"/>
         </w:rPr>
-        <w:t>Table 2. Per-iteration counts and accuracy on the 26-candidate human development sample (v1 to v3).</w:t>
+        <w:t>Table 2. Per-iteration counts and accuracy on the 26-candidate human development sample (14 sentences from the Unilever sustainability statement and 12 from the Keurig Dr Pepper impact report), v1 to v3.</w:t>
       </w:r>
     </w:p>
     <w:tbl>
@@ -5734,6 +5734,13 @@
       <w:r>
         <w:rPr>
           <w:rFonts w:ascii="Times New Roman" w:hAnsi="Times New Roman"/>
+          <w:highlight w:val="green"/>
+        </w:rPr>
+        <w:t xml:space="preserve"> Both strata are drawn from a single report. The manual review that supplies the carried-over labels was carried out on the Unilever sustainability statement, and the benchmark extends that work rather than beginning a second one; the earlier development sample of Table 2, by contrast, was drawn from both evaluation reports. The consequence of the single-report scope for the interpretation of the results is recorded in Activity 4.5.</w:t>
+      </w:r>
+      <w:r>
+        <w:rPr>
+          <w:rFonts w:ascii="Times New Roman" w:hAnsi="Times New Roman"/>
           <w:highlight w:val="red"/>
         </w:rPr>
         <w:t xml:space="preserve"> Annotation status in this draft: the 32 carried-over labels are final (23 Yes, 9 No); the 40 newly sampled extracted sentences and the 100 rejected sentences are assumed to contain 50% and 5% genuine claims respectively, and both will be replaced by the actual labels.</w:t>
@@ -9893,6 +9900,15 @@
           <w:highlight w:val="green"/>
         </w:rPr>
         <w:t>The scenario sentence discussed in WP3 shows the same limit from the opposite direction. "Net zero CO2e achieved by approximately 2070" contains a topic, an achievement verb and a year, passes every lexical test, and misled a careful annotator working sentence by sentence; only the surrounding table reveals that it describes an IPCC pathway rather than a company target. Context can therefore turn a convincing candidate into a non-claim just as it can turn a fragment into a claim, and neither direction is available to a classifier that sees one sentence at a time. This is the most direct argument in the study for classifying sentences with a window of surrounding context in WP5.</w:t>
+      </w:r>
+    </w:p>
+    <w:p>
+      <w:r>
+        <w:rPr>
+          <w:rFonts w:ascii="Times New Roman" w:hAnsi="Times New Roman"/>
+          <w:highlight w:val="green"/>
+        </w:rPr>
+        <w:t>A second limit is one of scope rather than of method. The benchmark measures the engine on one report, a regulatory sustainability statement prepared under the European Sustainability Reporting Standards. WP1 established that the corpus also contains a structurally different kind of document, the narrative impact report, whose sections are written as prose rather than as mandated disclosures, and whose proportions of methodology, governance and policy language are correspondingly lower. Since the residual errors of the engine are concentrated in exactly that language, the precision and recall reported above should be read as applying to this report type. A second benchmark on the Keurig Dr Pepper impact report, for which the engine extracts 218 candidates, would be required before the figures could be generalised across report types.</w:t>
       </w:r>
     </w:p>
     <w:p>

</xml_diff>